<commit_message>
se agregaron el diagrama de clases y el diagrama de modelo relacional
</commit_message>
<xml_diff>
--- a/Nutrición y Perfiles Alimentarios.docx
+++ b/Nutrición y Perfiles Alimentarios.docx
@@ -1,9 +1,10 @@
 
 <file path=word/document.xml><?xml version="1.0" encoding="utf-8"?>
-<w:document xmlns:wpc="http://schemas.microsoft.com/office/word/2010/wordprocessingCanvas" xmlns:cx="http://schemas.microsoft.com/office/drawing/2014/chartex" xmlns:cx1="http://schemas.microsoft.com/office/drawing/2015/9/8/chartex" xmlns:cx2="http://schemas.microsoft.com/office/drawing/2015/10/21/chartex" xmlns:cx3="http://schemas.microsoft.com/office/drawing/2016/5/9/chartex" xmlns:cx4="http://schemas.microsoft.com/office/drawing/2016/5/10/chartex" xmlns:cx5="http://schemas.microsoft.com/office/drawing/2016/5/11/chartex" xmlns:cx6="http://schemas.microsoft.com/office/drawing/2016/5/12/chartex" xmlns:cx7="http://schemas.microsoft.com/office/drawing/2016/5/13/chartex" xmlns:cx8="http://schemas.microsoft.com/office/drawing/2016/5/14/chartex" xmlns:mc="http://schemas.openxmlformats.org/markup-compatibility/2006" xmlns:aink="http://schemas.microsoft.com/office/drawing/2016/ink" xmlns:am3d="http://schemas.microsoft.com/office/drawing/2017/model3d" xmlns:o="urn:schemas-microsoft-com:office:office" xmlns:oel="http://schemas.microsoft.com/office/2019/extlst" xmlns:r="http://schemas.openxmlformats.org/officeDocument/2006/relationships" xmlns:m="http://schemas.openxmlformats.org/officeDocument/2006/math" xmlns:v="urn:schemas-microsoft-com:vml" xmlns:wp14="http://schemas.microsoft.com/office/word/2010/wordprocessingDrawing" xmlns:wp="http://schemas.openxmlformats.org/drawingml/2006/wordprocessingDrawing" xmlns:w10="urn:schemas-microsoft-com:office:word" xmlns:w="http://schemas.openxmlformats.org/wordprocessingml/2006/main" xmlns:w14="http://schemas.microsoft.com/office/word/2010/wordml" xmlns:w15="http://schemas.microsoft.com/office/word/2012/wordml" xmlns:w16cex="http://schemas.microsoft.com/office/word/2018/wordml/cex" xmlns:w16cid="http://schemas.microsoft.com/office/word/2016/wordml/cid" xmlns:w16="http://schemas.microsoft.com/office/word/2018/wordml" xmlns:w16du="http://schemas.microsoft.com/office/word/2023/wordml/word16du" xmlns:w16sdtdh="http://schemas.microsoft.com/office/word/2020/wordml/sdtdatahash" xmlns:w16se="http://schemas.microsoft.com/office/word/2015/wordml/symex" xmlns:wpg="http://schemas.microsoft.com/office/word/2010/wordprocessingGroup" xmlns:wpi="http://schemas.microsoft.com/office/word/2010/wordprocessingInk" xmlns:wne="http://schemas.microsoft.com/office/word/2006/wordml" xmlns:wps="http://schemas.microsoft.com/office/word/2010/wordprocessingShape" mc:Ignorable="w14 w15 w16se w16cid w16 w16cex w16sdtdh w16du wp14">
+<w:document xmlns:o="urn:schemas-microsoft-com:office:office" xmlns:r="http://schemas.openxmlformats.org/officeDocument/2006/relationships" xmlns:v="urn:schemas-microsoft-com:vml" xmlns:w="http://schemas.openxmlformats.org/wordprocessingml/2006/main" xmlns:w10="urn:schemas-microsoft-com:office:word" xmlns:wp="http://schemas.openxmlformats.org/drawingml/2006/wordprocessingDrawing" xmlns:pic="http://schemas.openxmlformats.org/drawingml/2006/picture" xmlns:wps="http://schemas.microsoft.com/office/word/2010/wordprocessingShape" xmlns:wpg="http://schemas.microsoft.com/office/word/2010/wordprocessingGroup" xmlns:mc="http://schemas.openxmlformats.org/markup-compatibility/2006" xmlns:wp14="http://schemas.microsoft.com/office/word/2010/wordprocessingDrawing" xmlns:w14="http://schemas.microsoft.com/office/word/2010/wordml" xmlns:w15="http://schemas.microsoft.com/office/word/2012/wordml" mc:Ignorable="w14 wp14 w15">
   <w:body>
     <w:p>
       <w:pPr>
+        <w:pStyle w:val="Normal"/>
         <w:rPr>
           <w:sz w:val="40"/>
           <w:szCs w:val="40"/>
@@ -19,6 +20,7 @@
     </w:p>
     <w:p>
       <w:pPr>
+        <w:pStyle w:val="Normal"/>
         <w:jc w:val="center"/>
         <w:rPr>
           <w:rFonts w:ascii="Arial" w:hAnsi="Arial" w:cs="Arial"/>
@@ -26,9 +28,17 @@
           <w:szCs w:val="40"/>
         </w:rPr>
       </w:pPr>
-    </w:p>
-    <w:p>
-      <w:pPr>
+      <w:r>
+        <w:rPr>
+          <w:rFonts w:cs="Arial" w:ascii="Arial" w:hAnsi="Arial"/>
+          <w:sz w:val="40"/>
+          <w:szCs w:val="40"/>
+        </w:rPr>
+      </w:r>
+    </w:p>
+    <w:p>
+      <w:pPr>
+        <w:pStyle w:val="Normal"/>
         <w:jc w:val="center"/>
         <w:rPr>
           <w:rFonts w:ascii="Arial" w:hAnsi="Arial" w:cs="Arial"/>
@@ -38,7 +48,7 @@
       </w:pPr>
       <w:r>
         <w:rPr>
-          <w:rFonts w:ascii="Arial" w:hAnsi="Arial" w:cs="Arial"/>
+          <w:rFonts w:cs="Arial" w:ascii="Arial" w:hAnsi="Arial"/>
           <w:sz w:val="40"/>
           <w:szCs w:val="40"/>
         </w:rPr>
@@ -47,19 +57,27 @@
     </w:p>
     <w:p>
       <w:pPr>
+        <w:pStyle w:val="Normal"/>
         <w:jc w:val="center"/>
         <w:rPr>
           <w:sz w:val="40"/>
           <w:szCs w:val="40"/>
         </w:rPr>
       </w:pPr>
-    </w:p>
-    <w:p>
-      <w:pPr>
-        <w:spacing w:before="100" w:beforeAutospacing="1" w:after="100" w:afterAutospacing="1" w:line="240" w:lineRule="auto"/>
+      <w:r>
+        <w:rPr>
+          <w:sz w:val="40"/>
+          <w:szCs w:val="40"/>
+        </w:rPr>
+      </w:r>
+    </w:p>
+    <w:p>
+      <w:pPr>
+        <w:pStyle w:val="Normal"/>
+        <w:spacing w:lineRule="auto" w:line="240" w:beforeAutospacing="1" w:afterAutospacing="1"/>
         <w:jc w:val="center"/>
         <w:rPr>
-          <w:rFonts w:ascii="Arial" w:eastAsia="Times New Roman" w:hAnsi="Arial" w:cs="Arial"/>
+          <w:rFonts w:ascii="Arial" w:hAnsi="Arial" w:eastAsia="Times New Roman" w:cs="Arial"/>
           <w:b/>
           <w:bCs/>
           <w:kern w:val="0"/>
@@ -69,23 +87,9 @@
           <w14:ligatures w14:val="none"/>
         </w:rPr>
       </w:pPr>
-    </w:p>
-    <w:p>
-      <w:pPr>
-        <w:spacing w:before="100" w:beforeAutospacing="1" w:after="100" w:afterAutospacing="1" w:line="240" w:lineRule="auto"/>
-        <w:jc w:val="center"/>
-        <w:rPr>
-          <w:rFonts w:ascii="Arial" w:eastAsia="Times New Roman" w:hAnsi="Arial" w:cs="Arial"/>
-          <w:kern w:val="0"/>
-          <w:sz w:val="24"/>
-          <w:szCs w:val="24"/>
-          <w:lang w:eastAsia="es-CO"/>
-          <w14:ligatures w14:val="none"/>
-        </w:rPr>
-      </w:pPr>
-      <w:r>
-        <w:rPr>
-          <w:rFonts w:ascii="Arial" w:eastAsia="Times New Roman" w:hAnsi="Arial" w:cs="Arial"/>
+      <w:r>
+        <w:rPr>
+          <w:rFonts w:eastAsia="Times New Roman" w:cs="Arial" w:ascii="Arial" w:hAnsi="Arial"/>
           <w:b/>
           <w:bCs/>
           <w:kern w:val="0"/>
@@ -94,29 +98,57 @@
           <w:lang w:eastAsia="es-CO"/>
           <w14:ligatures w14:val="none"/>
         </w:rPr>
+      </w:r>
+    </w:p>
+    <w:p>
+      <w:pPr>
+        <w:pStyle w:val="Normal"/>
+        <w:spacing w:lineRule="auto" w:line="240" w:beforeAutospacing="1" w:afterAutospacing="1"/>
+        <w:jc w:val="center"/>
+        <w:rPr>
+          <w:rFonts w:ascii="Arial" w:hAnsi="Arial" w:eastAsia="Times New Roman" w:cs="Arial"/>
+          <w:kern w:val="0"/>
+          <w:sz w:val="24"/>
+          <w:szCs w:val="24"/>
+          <w:lang w:eastAsia="es-CO"/>
+          <w14:ligatures w14:val="none"/>
+        </w:rPr>
+      </w:pPr>
+      <w:r>
+        <w:rPr>
+          <w:rFonts w:eastAsia="Times New Roman" w:cs="Arial" w:ascii="Arial" w:hAnsi="Arial"/>
+          <w:b/>
+          <w:bCs/>
+          <w:kern w:val="0"/>
+          <w:sz w:val="24"/>
+          <w:szCs w:val="24"/>
+          <w:lang w:eastAsia="es-CO"/>
+          <w14:ligatures w14:val="none"/>
+        </w:rPr>
         <w:t>Integrantes:</w:t>
       </w:r>
     </w:p>
     <w:p>
       <w:pPr>
+        <w:pStyle w:val="Normal"/>
         <w:numPr>
           <w:ilvl w:val="0"/>
           <w:numId w:val="1"/>
         </w:numPr>
-        <w:spacing w:before="100" w:beforeAutospacing="1" w:after="100" w:afterAutospacing="1" w:line="240" w:lineRule="auto"/>
+        <w:spacing w:lineRule="auto" w:line="240" w:beforeAutospacing="1" w:after="0"/>
         <w:jc w:val="center"/>
         <w:rPr>
-          <w:rFonts w:ascii="Arial" w:eastAsia="Times New Roman" w:hAnsi="Arial" w:cs="Arial"/>
-          <w:kern w:val="0"/>
-          <w:sz w:val="24"/>
-          <w:szCs w:val="24"/>
-          <w:lang w:eastAsia="es-CO"/>
-          <w14:ligatures w14:val="none"/>
-        </w:rPr>
-      </w:pPr>
-      <w:r>
-        <w:rPr>
-          <w:rFonts w:ascii="Arial" w:eastAsia="Times New Roman" w:hAnsi="Arial" w:cs="Arial"/>
+          <w:rFonts w:ascii="Arial" w:hAnsi="Arial" w:eastAsia="Times New Roman" w:cs="Arial"/>
+          <w:kern w:val="0"/>
+          <w:sz w:val="24"/>
+          <w:szCs w:val="24"/>
+          <w:lang w:eastAsia="es-CO"/>
+          <w14:ligatures w14:val="none"/>
+        </w:rPr>
+      </w:pPr>
+      <w:r>
+        <w:rPr>
+          <w:rFonts w:eastAsia="Times New Roman" w:cs="Arial" w:ascii="Arial" w:hAnsi="Arial"/>
           <w:kern w:val="0"/>
           <w:sz w:val="24"/>
           <w:szCs w:val="24"/>
@@ -128,24 +160,25 @@
     </w:p>
     <w:p>
       <w:pPr>
+        <w:pStyle w:val="Normal"/>
         <w:numPr>
           <w:ilvl w:val="0"/>
           <w:numId w:val="1"/>
         </w:numPr>
-        <w:spacing w:before="100" w:beforeAutospacing="1" w:after="100" w:afterAutospacing="1" w:line="240" w:lineRule="auto"/>
+        <w:spacing w:lineRule="auto" w:line="240" w:before="0" w:after="0"/>
         <w:jc w:val="center"/>
         <w:rPr>
-          <w:rFonts w:ascii="Arial" w:eastAsia="Times New Roman" w:hAnsi="Arial" w:cs="Arial"/>
-          <w:kern w:val="0"/>
-          <w:sz w:val="24"/>
-          <w:szCs w:val="24"/>
-          <w:lang w:eastAsia="es-CO"/>
-          <w14:ligatures w14:val="none"/>
-        </w:rPr>
-      </w:pPr>
-      <w:r>
-        <w:rPr>
-          <w:rFonts w:ascii="Arial" w:eastAsia="Times New Roman" w:hAnsi="Arial" w:cs="Arial"/>
+          <w:rFonts w:ascii="Arial" w:hAnsi="Arial" w:eastAsia="Times New Roman" w:cs="Arial"/>
+          <w:kern w:val="0"/>
+          <w:sz w:val="24"/>
+          <w:szCs w:val="24"/>
+          <w:lang w:eastAsia="es-CO"/>
+          <w14:ligatures w14:val="none"/>
+        </w:rPr>
+      </w:pPr>
+      <w:r>
+        <w:rPr>
+          <w:rFonts w:eastAsia="Times New Roman" w:cs="Arial" w:ascii="Arial" w:hAnsi="Arial"/>
           <w:kern w:val="0"/>
           <w:sz w:val="24"/>
           <w:szCs w:val="24"/>
@@ -156,7 +189,7 @@
       </w:r>
       <w:r>
         <w:rPr>
-          <w:rFonts w:ascii="Arial" w:eastAsia="Times New Roman" w:hAnsi="Arial" w:cs="Arial"/>
+          <w:rFonts w:eastAsia="Times New Roman" w:cs="Arial" w:ascii="Arial" w:hAnsi="Arial"/>
           <w:kern w:val="0"/>
           <w:sz w:val="24"/>
           <w:szCs w:val="24"/>
@@ -168,24 +201,25 @@
     </w:p>
     <w:p>
       <w:pPr>
+        <w:pStyle w:val="Normal"/>
         <w:numPr>
           <w:ilvl w:val="0"/>
           <w:numId w:val="1"/>
         </w:numPr>
-        <w:spacing w:before="100" w:beforeAutospacing="1" w:after="100" w:afterAutospacing="1" w:line="240" w:lineRule="auto"/>
+        <w:spacing w:lineRule="auto" w:line="240" w:before="0" w:after="0"/>
         <w:jc w:val="center"/>
         <w:rPr>
-          <w:rFonts w:ascii="Arial" w:eastAsia="Times New Roman" w:hAnsi="Arial" w:cs="Arial"/>
-          <w:kern w:val="0"/>
-          <w:sz w:val="24"/>
-          <w:szCs w:val="24"/>
-          <w:lang w:eastAsia="es-CO"/>
-          <w14:ligatures w14:val="none"/>
-        </w:rPr>
-      </w:pPr>
-      <w:r>
-        <w:rPr>
-          <w:rFonts w:ascii="Arial" w:eastAsia="Times New Roman" w:hAnsi="Arial" w:cs="Arial"/>
+          <w:rFonts w:ascii="Arial" w:hAnsi="Arial" w:eastAsia="Times New Roman" w:cs="Arial"/>
+          <w:kern w:val="0"/>
+          <w:sz w:val="24"/>
+          <w:szCs w:val="24"/>
+          <w:lang w:eastAsia="es-CO"/>
+          <w14:ligatures w14:val="none"/>
+        </w:rPr>
+      </w:pPr>
+      <w:r>
+        <w:rPr>
+          <w:rFonts w:eastAsia="Times New Roman" w:cs="Arial" w:ascii="Arial" w:hAnsi="Arial"/>
           <w:kern w:val="0"/>
           <w:sz w:val="24"/>
           <w:szCs w:val="24"/>
@@ -197,24 +231,25 @@
     </w:p>
     <w:p>
       <w:pPr>
+        <w:pStyle w:val="Normal"/>
         <w:numPr>
           <w:ilvl w:val="0"/>
           <w:numId w:val="1"/>
         </w:numPr>
-        <w:spacing w:before="100" w:beforeAutospacing="1" w:after="100" w:afterAutospacing="1" w:line="240" w:lineRule="auto"/>
+        <w:spacing w:lineRule="auto" w:line="240" w:before="0" w:after="0"/>
         <w:jc w:val="center"/>
         <w:rPr>
-          <w:rFonts w:ascii="Arial" w:eastAsia="Times New Roman" w:hAnsi="Arial" w:cs="Arial"/>
-          <w:kern w:val="0"/>
-          <w:sz w:val="24"/>
-          <w:szCs w:val="24"/>
-          <w:lang w:eastAsia="es-CO"/>
-          <w14:ligatures w14:val="none"/>
-        </w:rPr>
-      </w:pPr>
-      <w:r>
-        <w:rPr>
-          <w:rFonts w:ascii="Arial" w:eastAsia="Times New Roman" w:hAnsi="Arial" w:cs="Arial"/>
+          <w:rFonts w:ascii="Arial" w:hAnsi="Arial" w:eastAsia="Times New Roman" w:cs="Arial"/>
+          <w:kern w:val="0"/>
+          <w:sz w:val="24"/>
+          <w:szCs w:val="24"/>
+          <w:lang w:eastAsia="es-CO"/>
+          <w14:ligatures w14:val="none"/>
+        </w:rPr>
+      </w:pPr>
+      <w:r>
+        <w:rPr>
+          <w:rFonts w:eastAsia="Times New Roman" w:cs="Arial" w:ascii="Arial" w:hAnsi="Arial"/>
           <w:kern w:val="0"/>
           <w:sz w:val="24"/>
           <w:szCs w:val="24"/>
@@ -226,24 +261,25 @@
     </w:p>
     <w:p>
       <w:pPr>
+        <w:pStyle w:val="Normal"/>
         <w:numPr>
           <w:ilvl w:val="0"/>
           <w:numId w:val="1"/>
         </w:numPr>
-        <w:spacing w:before="100" w:beforeAutospacing="1" w:after="100" w:afterAutospacing="1" w:line="240" w:lineRule="auto"/>
+        <w:spacing w:lineRule="auto" w:line="240" w:before="0" w:afterAutospacing="1"/>
         <w:jc w:val="center"/>
         <w:rPr>
-          <w:rFonts w:ascii="Arial" w:eastAsia="Times New Roman" w:hAnsi="Arial" w:cs="Arial"/>
-          <w:kern w:val="0"/>
-          <w:sz w:val="24"/>
-          <w:szCs w:val="24"/>
-          <w:lang w:eastAsia="es-CO"/>
-          <w14:ligatures w14:val="none"/>
-        </w:rPr>
-      </w:pPr>
-      <w:r>
-        <w:rPr>
-          <w:rFonts w:ascii="Arial" w:eastAsia="Times New Roman" w:hAnsi="Arial" w:cs="Arial"/>
+          <w:rFonts w:ascii="Arial" w:hAnsi="Arial" w:eastAsia="Times New Roman" w:cs="Arial"/>
+          <w:kern w:val="0"/>
+          <w:sz w:val="24"/>
+          <w:szCs w:val="24"/>
+          <w:lang w:eastAsia="es-CO"/>
+          <w14:ligatures w14:val="none"/>
+        </w:rPr>
+      </w:pPr>
+      <w:r>
+        <w:rPr>
+          <w:rFonts w:eastAsia="Times New Roman" w:cs="Arial" w:ascii="Arial" w:hAnsi="Arial"/>
           <w:kern w:val="0"/>
           <w:sz w:val="24"/>
           <w:szCs w:val="24"/>
@@ -255,76 +291,121 @@
     </w:p>
     <w:p>
       <w:pPr>
-        <w:spacing w:before="100" w:beforeAutospacing="1" w:after="100" w:afterAutospacing="1" w:line="240" w:lineRule="auto"/>
+        <w:pStyle w:val="Normal"/>
+        <w:spacing w:lineRule="auto" w:line="240" w:beforeAutospacing="1" w:afterAutospacing="1"/>
         <w:jc w:val="center"/>
         <w:rPr>
-          <w:rFonts w:ascii="Arial" w:eastAsia="Times New Roman" w:hAnsi="Arial" w:cs="Arial"/>
-          <w:kern w:val="0"/>
-          <w:sz w:val="24"/>
-          <w:szCs w:val="24"/>
-          <w:lang w:eastAsia="es-CO"/>
-          <w14:ligatures w14:val="none"/>
-        </w:rPr>
-      </w:pPr>
-    </w:p>
-    <w:p>
-      <w:pPr>
-        <w:spacing w:before="100" w:beforeAutospacing="1" w:after="100" w:afterAutospacing="1" w:line="240" w:lineRule="auto"/>
+          <w:rFonts w:ascii="Arial" w:hAnsi="Arial" w:eastAsia="Times New Roman" w:cs="Arial"/>
+          <w:kern w:val="0"/>
+          <w:sz w:val="24"/>
+          <w:szCs w:val="24"/>
+          <w:lang w:eastAsia="es-CO"/>
+          <w14:ligatures w14:val="none"/>
+        </w:rPr>
+      </w:pPr>
+      <w:r>
+        <w:rPr>
+          <w:rFonts w:eastAsia="Times New Roman" w:cs="Arial" w:ascii="Arial" w:hAnsi="Arial"/>
+          <w:kern w:val="0"/>
+          <w:sz w:val="24"/>
+          <w:szCs w:val="24"/>
+          <w:lang w:eastAsia="es-CO"/>
+          <w14:ligatures w14:val="none"/>
+        </w:rPr>
+      </w:r>
+    </w:p>
+    <w:p>
+      <w:pPr>
+        <w:pStyle w:val="Normal"/>
+        <w:spacing w:lineRule="auto" w:line="240" w:beforeAutospacing="1" w:afterAutospacing="1"/>
         <w:jc w:val="center"/>
         <w:rPr>
-          <w:rFonts w:ascii="Arial" w:eastAsia="Times New Roman" w:hAnsi="Arial" w:cs="Arial"/>
-          <w:kern w:val="0"/>
-          <w:sz w:val="24"/>
-          <w:szCs w:val="24"/>
-          <w:lang w:eastAsia="es-CO"/>
-          <w14:ligatures w14:val="none"/>
-        </w:rPr>
-      </w:pPr>
-    </w:p>
-    <w:p>
-      <w:pPr>
-        <w:spacing w:before="100" w:beforeAutospacing="1" w:after="100" w:afterAutospacing="1" w:line="240" w:lineRule="auto"/>
+          <w:rFonts w:ascii="Arial" w:hAnsi="Arial" w:eastAsia="Times New Roman" w:cs="Arial"/>
+          <w:kern w:val="0"/>
+          <w:sz w:val="24"/>
+          <w:szCs w:val="24"/>
+          <w:lang w:eastAsia="es-CO"/>
+          <w14:ligatures w14:val="none"/>
+        </w:rPr>
+      </w:pPr>
+      <w:r>
+        <w:rPr>
+          <w:rFonts w:eastAsia="Times New Roman" w:cs="Arial" w:ascii="Arial" w:hAnsi="Arial"/>
+          <w:kern w:val="0"/>
+          <w:sz w:val="24"/>
+          <w:szCs w:val="24"/>
+          <w:lang w:eastAsia="es-CO"/>
+          <w14:ligatures w14:val="none"/>
+        </w:rPr>
+      </w:r>
+    </w:p>
+    <w:p>
+      <w:pPr>
+        <w:pStyle w:val="Normal"/>
+        <w:spacing w:lineRule="auto" w:line="240" w:beforeAutospacing="1" w:afterAutospacing="1"/>
         <w:jc w:val="center"/>
         <w:rPr>
-          <w:rFonts w:ascii="Arial" w:eastAsia="Times New Roman" w:hAnsi="Arial" w:cs="Arial"/>
-          <w:kern w:val="0"/>
-          <w:sz w:val="24"/>
-          <w:szCs w:val="24"/>
-          <w:lang w:eastAsia="es-CO"/>
-          <w14:ligatures w14:val="none"/>
-        </w:rPr>
-      </w:pPr>
-    </w:p>
-    <w:p>
-      <w:pPr>
-        <w:spacing w:before="100" w:beforeAutospacing="1" w:after="100" w:afterAutospacing="1" w:line="240" w:lineRule="auto"/>
+          <w:rFonts w:ascii="Arial" w:hAnsi="Arial" w:eastAsia="Times New Roman" w:cs="Arial"/>
+          <w:kern w:val="0"/>
+          <w:sz w:val="24"/>
+          <w:szCs w:val="24"/>
+          <w:lang w:eastAsia="es-CO"/>
+          <w14:ligatures w14:val="none"/>
+        </w:rPr>
+      </w:pPr>
+      <w:r>
+        <w:rPr>
+          <w:rFonts w:eastAsia="Times New Roman" w:cs="Arial" w:ascii="Arial" w:hAnsi="Arial"/>
+          <w:kern w:val="0"/>
+          <w:sz w:val="24"/>
+          <w:szCs w:val="24"/>
+          <w:lang w:eastAsia="es-CO"/>
+          <w14:ligatures w14:val="none"/>
+        </w:rPr>
+      </w:r>
+    </w:p>
+    <w:p>
+      <w:pPr>
+        <w:pStyle w:val="Normal"/>
+        <w:spacing w:lineRule="auto" w:line="240" w:beforeAutospacing="1" w:afterAutospacing="1"/>
         <w:jc w:val="center"/>
         <w:rPr>
-          <w:rFonts w:ascii="Arial" w:eastAsia="Times New Roman" w:hAnsi="Arial" w:cs="Arial"/>
-          <w:kern w:val="0"/>
-          <w:sz w:val="24"/>
-          <w:szCs w:val="24"/>
-          <w:lang w:eastAsia="es-CO"/>
-          <w14:ligatures w14:val="none"/>
-        </w:rPr>
-      </w:pPr>
-    </w:p>
-    <w:p>
-      <w:pPr>
-        <w:spacing w:before="100" w:beforeAutospacing="1" w:after="100" w:afterAutospacing="1" w:line="240" w:lineRule="auto"/>
+          <w:rFonts w:ascii="Arial" w:hAnsi="Arial" w:eastAsia="Times New Roman" w:cs="Arial"/>
+          <w:kern w:val="0"/>
+          <w:sz w:val="24"/>
+          <w:szCs w:val="24"/>
+          <w:lang w:eastAsia="es-CO"/>
+          <w14:ligatures w14:val="none"/>
+        </w:rPr>
+      </w:pPr>
+      <w:r>
+        <w:rPr>
+          <w:rFonts w:eastAsia="Times New Roman" w:cs="Arial" w:ascii="Arial" w:hAnsi="Arial"/>
+          <w:kern w:val="0"/>
+          <w:sz w:val="24"/>
+          <w:szCs w:val="24"/>
+          <w:lang w:eastAsia="es-CO"/>
+          <w14:ligatures w14:val="none"/>
+        </w:rPr>
+      </w:r>
+    </w:p>
+    <w:p>
+      <w:pPr>
+        <w:pStyle w:val="Normal"/>
+        <w:spacing w:lineRule="auto" w:line="240" w:beforeAutospacing="1" w:afterAutospacing="1"/>
         <w:jc w:val="center"/>
         <w:rPr>
-          <w:rFonts w:ascii="Arial" w:eastAsia="Times New Roman" w:hAnsi="Arial" w:cs="Arial"/>
-          <w:kern w:val="0"/>
-          <w:sz w:val="24"/>
-          <w:szCs w:val="24"/>
-          <w:lang w:eastAsia="es-CO"/>
-          <w14:ligatures w14:val="none"/>
-        </w:rPr>
-      </w:pPr>
-      <w:r>
-        <w:rPr>
-          <w:rFonts w:ascii="Arial" w:eastAsia="Times New Roman" w:hAnsi="Arial" w:cs="Arial"/>
+          <w:rFonts w:ascii="Arial" w:hAnsi="Arial" w:eastAsia="Times New Roman" w:cs="Arial"/>
+          <w:kern w:val="0"/>
+          <w:sz w:val="24"/>
+          <w:szCs w:val="24"/>
+          <w:lang w:eastAsia="es-CO"/>
+          <w14:ligatures w14:val="none"/>
+        </w:rPr>
+      </w:pPr>
+      <w:r>
+        <w:rPr>
+          <w:rFonts w:eastAsia="Times New Roman" w:cs="Arial" w:ascii="Arial" w:hAnsi="Arial"/>
           <w:kern w:val="0"/>
           <w:sz w:val="24"/>
           <w:szCs w:val="24"/>
@@ -336,20 +417,21 @@
     </w:p>
     <w:p>
       <w:pPr>
-        <w:spacing w:before="100" w:beforeAutospacing="1" w:after="100" w:afterAutospacing="1" w:line="240" w:lineRule="auto"/>
+        <w:pStyle w:val="Normal"/>
+        <w:spacing w:lineRule="auto" w:line="240" w:beforeAutospacing="1" w:afterAutospacing="1"/>
         <w:jc w:val="center"/>
         <w:rPr>
-          <w:rFonts w:ascii="Arial" w:eastAsia="Times New Roman" w:hAnsi="Arial" w:cs="Arial"/>
-          <w:kern w:val="0"/>
-          <w:sz w:val="24"/>
-          <w:szCs w:val="24"/>
-          <w:lang w:eastAsia="es-CO"/>
-          <w14:ligatures w14:val="none"/>
-        </w:rPr>
-      </w:pPr>
-      <w:r>
-        <w:rPr>
-          <w:rFonts w:ascii="Arial" w:eastAsia="Times New Roman" w:hAnsi="Arial" w:cs="Arial"/>
+          <w:rFonts w:ascii="Arial" w:hAnsi="Arial" w:eastAsia="Times New Roman" w:cs="Arial"/>
+          <w:kern w:val="0"/>
+          <w:sz w:val="24"/>
+          <w:szCs w:val="24"/>
+          <w:lang w:eastAsia="es-CO"/>
+          <w14:ligatures w14:val="none"/>
+        </w:rPr>
+      </w:pPr>
+      <w:r>
+        <w:rPr>
+          <w:rFonts w:eastAsia="Times New Roman" w:cs="Arial" w:ascii="Arial" w:hAnsi="Arial"/>
           <w:kern w:val="0"/>
           <w:sz w:val="24"/>
           <w:szCs w:val="24"/>
@@ -361,77 +443,121 @@
     </w:p>
     <w:p>
       <w:pPr>
-        <w:spacing w:before="100" w:beforeAutospacing="1" w:after="100" w:afterAutospacing="1" w:line="240" w:lineRule="auto"/>
+        <w:pStyle w:val="Normal"/>
+        <w:spacing w:lineRule="auto" w:line="240" w:beforeAutospacing="1" w:afterAutospacing="1"/>
         <w:jc w:val="center"/>
         <w:rPr>
-          <w:rFonts w:ascii="Arial" w:eastAsia="Times New Roman" w:hAnsi="Arial" w:cs="Arial"/>
-          <w:kern w:val="0"/>
-          <w:sz w:val="24"/>
-          <w:szCs w:val="24"/>
-          <w:lang w:eastAsia="es-CO"/>
-          <w14:ligatures w14:val="none"/>
-        </w:rPr>
-      </w:pPr>
-    </w:p>
-    <w:p>
-      <w:pPr>
-        <w:spacing w:before="100" w:beforeAutospacing="1" w:after="100" w:afterAutospacing="1" w:line="240" w:lineRule="auto"/>
+          <w:rFonts w:ascii="Arial" w:hAnsi="Arial" w:eastAsia="Times New Roman" w:cs="Arial"/>
+          <w:kern w:val="0"/>
+          <w:sz w:val="24"/>
+          <w:szCs w:val="24"/>
+          <w:lang w:eastAsia="es-CO"/>
+          <w14:ligatures w14:val="none"/>
+        </w:rPr>
+      </w:pPr>
+      <w:r>
+        <w:rPr>
+          <w:rFonts w:eastAsia="Times New Roman" w:cs="Arial" w:ascii="Arial" w:hAnsi="Arial"/>
+          <w:kern w:val="0"/>
+          <w:sz w:val="24"/>
+          <w:szCs w:val="24"/>
+          <w:lang w:eastAsia="es-CO"/>
+          <w14:ligatures w14:val="none"/>
+        </w:rPr>
+      </w:r>
+    </w:p>
+    <w:p>
+      <w:pPr>
+        <w:pStyle w:val="Normal"/>
+        <w:spacing w:lineRule="auto" w:line="240" w:beforeAutospacing="1" w:afterAutospacing="1"/>
         <w:jc w:val="center"/>
         <w:rPr>
-          <w:rFonts w:ascii="Arial" w:eastAsia="Times New Roman" w:hAnsi="Arial" w:cs="Arial"/>
-          <w:kern w:val="0"/>
-          <w:sz w:val="24"/>
-          <w:szCs w:val="24"/>
-          <w:lang w:eastAsia="es-CO"/>
-          <w14:ligatures w14:val="none"/>
-        </w:rPr>
-      </w:pPr>
-    </w:p>
-    <w:p>
-      <w:pPr>
-        <w:spacing w:before="100" w:beforeAutospacing="1" w:after="100" w:afterAutospacing="1" w:line="240" w:lineRule="auto"/>
+          <w:rFonts w:ascii="Arial" w:hAnsi="Arial" w:eastAsia="Times New Roman" w:cs="Arial"/>
+          <w:kern w:val="0"/>
+          <w:sz w:val="24"/>
+          <w:szCs w:val="24"/>
+          <w:lang w:eastAsia="es-CO"/>
+          <w14:ligatures w14:val="none"/>
+        </w:rPr>
+      </w:pPr>
+      <w:r>
+        <w:rPr>
+          <w:rFonts w:eastAsia="Times New Roman" w:cs="Arial" w:ascii="Arial" w:hAnsi="Arial"/>
+          <w:kern w:val="0"/>
+          <w:sz w:val="24"/>
+          <w:szCs w:val="24"/>
+          <w:lang w:eastAsia="es-CO"/>
+          <w14:ligatures w14:val="none"/>
+        </w:rPr>
+      </w:r>
+    </w:p>
+    <w:p>
+      <w:pPr>
+        <w:pStyle w:val="Normal"/>
+        <w:spacing w:lineRule="auto" w:line="240" w:beforeAutospacing="1" w:afterAutospacing="1"/>
         <w:jc w:val="center"/>
         <w:rPr>
-          <w:rFonts w:ascii="Arial" w:eastAsia="Times New Roman" w:hAnsi="Arial" w:cs="Arial"/>
-          <w:kern w:val="0"/>
-          <w:sz w:val="24"/>
-          <w:szCs w:val="24"/>
-          <w:lang w:eastAsia="es-CO"/>
-          <w14:ligatures w14:val="none"/>
-        </w:rPr>
-      </w:pPr>
-    </w:p>
-    <w:p>
-      <w:pPr>
-        <w:spacing w:before="100" w:beforeAutospacing="1" w:after="100" w:afterAutospacing="1" w:line="240" w:lineRule="auto"/>
+          <w:rFonts w:ascii="Arial" w:hAnsi="Arial" w:eastAsia="Times New Roman" w:cs="Arial"/>
+          <w:kern w:val="0"/>
+          <w:sz w:val="24"/>
+          <w:szCs w:val="24"/>
+          <w:lang w:eastAsia="es-CO"/>
+          <w14:ligatures w14:val="none"/>
+        </w:rPr>
+      </w:pPr>
+      <w:r>
+        <w:rPr>
+          <w:rFonts w:eastAsia="Times New Roman" w:cs="Arial" w:ascii="Arial" w:hAnsi="Arial"/>
+          <w:kern w:val="0"/>
+          <w:sz w:val="24"/>
+          <w:szCs w:val="24"/>
+          <w:lang w:eastAsia="es-CO"/>
+          <w14:ligatures w14:val="none"/>
+        </w:rPr>
+      </w:r>
+    </w:p>
+    <w:p>
+      <w:pPr>
+        <w:pStyle w:val="Normal"/>
+        <w:spacing w:lineRule="auto" w:line="240" w:beforeAutospacing="1" w:afterAutospacing="1"/>
         <w:jc w:val="center"/>
         <w:rPr>
-          <w:rFonts w:ascii="Arial" w:eastAsia="Times New Roman" w:hAnsi="Arial" w:cs="Arial"/>
-          <w:kern w:val="0"/>
-          <w:sz w:val="24"/>
-          <w:szCs w:val="24"/>
-          <w:lang w:eastAsia="es-CO"/>
-          <w14:ligatures w14:val="none"/>
-        </w:rPr>
-      </w:pPr>
-    </w:p>
-    <w:p>
-      <w:pPr>
-        <w:spacing w:before="100" w:beforeAutospacing="1" w:after="100" w:afterAutospacing="1" w:line="240" w:lineRule="auto"/>
+          <w:rFonts w:ascii="Arial" w:hAnsi="Arial" w:eastAsia="Times New Roman" w:cs="Arial"/>
+          <w:kern w:val="0"/>
+          <w:sz w:val="24"/>
+          <w:szCs w:val="24"/>
+          <w:lang w:eastAsia="es-CO"/>
+          <w14:ligatures w14:val="none"/>
+        </w:rPr>
+      </w:pPr>
+      <w:r>
+        <w:rPr>
+          <w:rFonts w:eastAsia="Times New Roman" w:cs="Arial" w:ascii="Arial" w:hAnsi="Arial"/>
+          <w:kern w:val="0"/>
+          <w:sz w:val="24"/>
+          <w:szCs w:val="24"/>
+          <w:lang w:eastAsia="es-CO"/>
+          <w14:ligatures w14:val="none"/>
+        </w:rPr>
+      </w:r>
+    </w:p>
+    <w:p>
+      <w:pPr>
+        <w:pStyle w:val="Normal"/>
+        <w:spacing w:lineRule="auto" w:line="240" w:beforeAutospacing="1" w:afterAutospacing="1"/>
         <w:jc w:val="center"/>
         <w:rPr>
-          <w:rFonts w:ascii="Arial" w:eastAsia="Times New Roman" w:hAnsi="Arial" w:cs="Arial"/>
-          <w:kern w:val="0"/>
-          <w:sz w:val="24"/>
-          <w:szCs w:val="24"/>
-          <w:lang w:eastAsia="es-CO"/>
-          <w14:ligatures w14:val="none"/>
-        </w:rPr>
-      </w:pPr>
-      <w:proofErr w:type="spellStart"/>
-      <w:r>
-        <w:rPr>
-          <w:rFonts w:ascii="Arial" w:eastAsia="Times New Roman" w:hAnsi="Arial" w:cs="Arial"/>
+          <w:rFonts w:ascii="Arial" w:hAnsi="Arial" w:eastAsia="Times New Roman" w:cs="Arial"/>
+          <w:kern w:val="0"/>
+          <w:sz w:val="24"/>
+          <w:szCs w:val="24"/>
+          <w:lang w:eastAsia="es-CO"/>
+          <w14:ligatures w14:val="none"/>
+        </w:rPr>
+      </w:pPr>
+      <w:r>
+        <w:rPr>
+          <w:rFonts w:eastAsia="Times New Roman" w:cs="Arial" w:ascii="Arial" w:hAnsi="Arial"/>
           <w:kern w:val="0"/>
           <w:sz w:val="24"/>
           <w:szCs w:val="24"/>
@@ -440,83 +566,97 @@
         </w:rPr>
         <w:t>Cesde</w:t>
       </w:r>
-      <w:proofErr w:type="spellEnd"/>
-    </w:p>
-    <w:p>
-      <w:pPr>
-        <w:spacing w:before="100" w:beforeAutospacing="1" w:after="100" w:afterAutospacing="1" w:line="240" w:lineRule="auto"/>
+    </w:p>
+    <w:p>
+      <w:pPr>
+        <w:pStyle w:val="Normal"/>
+        <w:spacing w:lineRule="auto" w:line="240" w:beforeAutospacing="1" w:afterAutospacing="1"/>
         <w:jc w:val="center"/>
         <w:rPr>
-          <w:rFonts w:ascii="Arial" w:eastAsia="Times New Roman" w:hAnsi="Arial" w:cs="Arial"/>
-          <w:kern w:val="0"/>
-          <w:sz w:val="24"/>
-          <w:szCs w:val="24"/>
-          <w:lang w:eastAsia="es-CO"/>
-          <w14:ligatures w14:val="none"/>
-        </w:rPr>
-      </w:pPr>
-    </w:p>
-    <w:p>
-      <w:pPr>
-        <w:spacing w:before="100" w:beforeAutospacing="1" w:after="100" w:afterAutospacing="1" w:line="240" w:lineRule="auto"/>
+          <w:rFonts w:ascii="Arial" w:hAnsi="Arial" w:eastAsia="Times New Roman" w:cs="Arial"/>
+          <w:kern w:val="0"/>
+          <w:sz w:val="24"/>
+          <w:szCs w:val="24"/>
+          <w:lang w:eastAsia="es-CO"/>
+          <w14:ligatures w14:val="none"/>
+        </w:rPr>
+      </w:pPr>
+      <w:r>
+        <w:rPr>
+          <w:rFonts w:eastAsia="Times New Roman" w:cs="Arial" w:ascii="Arial" w:hAnsi="Arial"/>
+          <w:kern w:val="0"/>
+          <w:sz w:val="24"/>
+          <w:szCs w:val="24"/>
+          <w:lang w:eastAsia="es-CO"/>
+          <w14:ligatures w14:val="none"/>
+        </w:rPr>
+      </w:r>
+    </w:p>
+    <w:p>
+      <w:pPr>
+        <w:pStyle w:val="Normal"/>
+        <w:spacing w:lineRule="auto" w:line="240" w:beforeAutospacing="1" w:afterAutospacing="1"/>
         <w:jc w:val="center"/>
         <w:rPr>
-          <w:rFonts w:ascii="Arial" w:eastAsia="Times New Roman" w:hAnsi="Arial" w:cs="Arial"/>
-          <w:kern w:val="0"/>
-          <w:sz w:val="24"/>
-          <w:szCs w:val="24"/>
-          <w:lang w:eastAsia="es-CO"/>
-          <w14:ligatures w14:val="none"/>
-        </w:rPr>
-      </w:pPr>
-      <w:proofErr w:type="spellStart"/>
-      <w:r>
-        <w:rPr>
-          <w:rFonts w:ascii="Arial" w:eastAsia="Times New Roman" w:hAnsi="Arial" w:cs="Arial"/>
-          <w:kern w:val="0"/>
-          <w:sz w:val="24"/>
-          <w:szCs w:val="24"/>
-          <w:lang w:eastAsia="es-CO"/>
-          <w14:ligatures w14:val="none"/>
-        </w:rPr>
-        <w:t>Medellin</w:t>
-      </w:r>
-      <w:proofErr w:type="spellEnd"/>
-      <w:r>
-        <w:rPr>
-          <w:rFonts w:ascii="Arial" w:eastAsia="Times New Roman" w:hAnsi="Arial" w:cs="Arial"/>
-          <w:kern w:val="0"/>
-          <w:sz w:val="24"/>
-          <w:szCs w:val="24"/>
-          <w:lang w:eastAsia="es-CO"/>
-          <w14:ligatures w14:val="none"/>
-        </w:rPr>
-        <w:t xml:space="preserve"> Colombia -2026</w:t>
-      </w:r>
-    </w:p>
-    <w:p>
-      <w:pPr>
-        <w:spacing w:before="100" w:beforeAutospacing="1" w:after="100" w:afterAutospacing="1" w:line="240" w:lineRule="auto"/>
+          <w:rFonts w:ascii="Arial" w:hAnsi="Arial" w:eastAsia="Times New Roman" w:cs="Arial"/>
+          <w:kern w:val="0"/>
+          <w:sz w:val="24"/>
+          <w:szCs w:val="24"/>
+          <w:lang w:eastAsia="es-CO"/>
+          <w14:ligatures w14:val="none"/>
+        </w:rPr>
+      </w:pPr>
+      <w:r>
+        <w:rPr>
+          <w:rFonts w:eastAsia="Times New Roman" w:cs="Arial" w:ascii="Arial" w:hAnsi="Arial"/>
+          <w:kern w:val="0"/>
+          <w:sz w:val="24"/>
+          <w:szCs w:val="24"/>
+          <w:lang w:eastAsia="es-CO"/>
+          <w14:ligatures w14:val="none"/>
+        </w:rPr>
+        <w:t>Medellin Colombia -2026</w:t>
+      </w:r>
+    </w:p>
+    <w:p>
+      <w:pPr>
+        <w:pStyle w:val="Normal"/>
+        <w:spacing w:lineRule="auto" w:line="240" w:beforeAutospacing="1" w:afterAutospacing="1"/>
         <w:jc w:val="center"/>
         <w:rPr>
-          <w:rFonts w:ascii="Times New Roman" w:eastAsia="Times New Roman" w:hAnsi="Times New Roman" w:cs="Times New Roman"/>
-          <w:kern w:val="0"/>
-          <w:sz w:val="24"/>
-          <w:szCs w:val="24"/>
-          <w:lang w:eastAsia="es-CO"/>
-          <w14:ligatures w14:val="none"/>
-        </w:rPr>
-      </w:pPr>
-    </w:p>
-    <w:p>
-      <w:pPr>
-        <w:spacing w:before="100" w:beforeAutospacing="1" w:after="100" w:afterAutospacing="1" w:line="240" w:lineRule="auto"/>
+          <w:rFonts w:ascii="Times New Roman" w:hAnsi="Times New Roman" w:eastAsia="Times New Roman" w:cs="Times New Roman"/>
+          <w:kern w:val="0"/>
+          <w:sz w:val="24"/>
+          <w:szCs w:val="24"/>
+          <w:lang w:eastAsia="es-CO"/>
+          <w14:ligatures w14:val="none"/>
+        </w:rPr>
+      </w:pPr>
+      <w:r>
+        <w:rPr>
+          <w:rFonts w:eastAsia="Times New Roman" w:cs="Times New Roman" w:ascii="Times New Roman" w:hAnsi="Times New Roman"/>
+          <w:kern w:val="0"/>
+          <w:sz w:val="24"/>
+          <w:szCs w:val="24"/>
+          <w:lang w:eastAsia="es-CO"/>
+          <w14:ligatures w14:val="none"/>
+        </w:rPr>
+      </w:r>
+    </w:p>
+    <w:p>
+      <w:pPr>
+        <w:pStyle w:val="Normal"/>
+        <w:numPr>
+          <w:ilvl w:val="0"/>
+          <w:numId w:val="0"/>
+        </w:numPr>
+        <w:spacing w:lineRule="auto" w:line="240" w:beforeAutospacing="1" w:afterAutospacing="1"/>
         <w:outlineLvl w:val="0"/>
         <w:rPr>
-          <w:rFonts w:ascii="Arial" w:eastAsia="Times New Roman" w:hAnsi="Arial" w:cs="Arial"/>
+          <w:rFonts w:ascii="Arial" w:hAnsi="Arial" w:eastAsia="Times New Roman" w:cs="Arial"/>
           <w:b/>
           <w:bCs/>
-          <w:kern w:val="36"/>
+          <w:kern w:val="2"/>
           <w:sz w:val="48"/>
           <w:szCs w:val="48"/>
           <w:lang w:eastAsia="es-CO"/>
@@ -525,10 +665,10 @@
       </w:pPr>
       <w:r>
         <w:rPr>
-          <w:rFonts w:ascii="Arial" w:eastAsia="Times New Roman" w:hAnsi="Arial" w:cs="Arial"/>
+          <w:rFonts w:eastAsia="Times New Roman" w:cs="Arial" w:ascii="Arial" w:hAnsi="Arial"/>
           <w:b/>
           <w:bCs/>
-          <w:kern w:val="36"/>
+          <w:kern w:val="2"/>
           <w:sz w:val="48"/>
           <w:szCs w:val="48"/>
           <w:lang w:eastAsia="es-CO"/>
@@ -539,19 +679,20 @@
     </w:p>
     <w:p>
       <w:pPr>
-        <w:spacing w:before="100" w:beforeAutospacing="1" w:after="100" w:afterAutospacing="1" w:line="240" w:lineRule="auto"/>
-        <w:rPr>
-          <w:rFonts w:ascii="Arial" w:eastAsia="Times New Roman" w:hAnsi="Arial" w:cs="Arial"/>
-          <w:kern w:val="0"/>
-          <w:sz w:val="24"/>
-          <w:szCs w:val="24"/>
-          <w:lang w:eastAsia="es-CO"/>
-          <w14:ligatures w14:val="none"/>
-        </w:rPr>
-      </w:pPr>
-      <w:r>
-        <w:rPr>
-          <w:rFonts w:ascii="Arial" w:eastAsia="Times New Roman" w:hAnsi="Arial" w:cs="Arial"/>
+        <w:pStyle w:val="Normal"/>
+        <w:spacing w:lineRule="auto" w:line="240" w:beforeAutospacing="1" w:afterAutospacing="1"/>
+        <w:rPr>
+          <w:rFonts w:ascii="Arial" w:hAnsi="Arial" w:eastAsia="Times New Roman" w:cs="Arial"/>
+          <w:kern w:val="0"/>
+          <w:sz w:val="24"/>
+          <w:szCs w:val="24"/>
+          <w:lang w:eastAsia="es-CO"/>
+          <w14:ligatures w14:val="none"/>
+        </w:rPr>
+      </w:pPr>
+      <w:r>
+        <w:rPr>
+          <w:rFonts w:eastAsia="Times New Roman" w:cs="Arial" w:ascii="Arial" w:hAnsi="Arial"/>
           <w:kern w:val="0"/>
           <w:sz w:val="24"/>
           <w:szCs w:val="24"/>
@@ -563,19 +704,20 @@
     </w:p>
     <w:p>
       <w:pPr>
-        <w:spacing w:before="100" w:beforeAutospacing="1" w:after="100" w:afterAutospacing="1" w:line="240" w:lineRule="auto"/>
-        <w:rPr>
-          <w:rFonts w:ascii="Arial" w:eastAsia="Times New Roman" w:hAnsi="Arial" w:cs="Arial"/>
-          <w:kern w:val="0"/>
-          <w:sz w:val="24"/>
-          <w:szCs w:val="24"/>
-          <w:lang w:eastAsia="es-CO"/>
-          <w14:ligatures w14:val="none"/>
-        </w:rPr>
-      </w:pPr>
-      <w:r>
-        <w:rPr>
-          <w:rFonts w:ascii="Arial" w:eastAsia="Times New Roman" w:hAnsi="Arial" w:cs="Arial"/>
+        <w:pStyle w:val="Normal"/>
+        <w:spacing w:lineRule="auto" w:line="240" w:beforeAutospacing="1" w:afterAutospacing="1"/>
+        <w:rPr>
+          <w:rFonts w:ascii="Arial" w:hAnsi="Arial" w:eastAsia="Times New Roman" w:cs="Arial"/>
+          <w:kern w:val="0"/>
+          <w:sz w:val="24"/>
+          <w:szCs w:val="24"/>
+          <w:lang w:eastAsia="es-CO"/>
+          <w14:ligatures w14:val="none"/>
+        </w:rPr>
+      </w:pPr>
+      <w:r>
+        <w:rPr>
+          <w:rFonts w:eastAsia="Times New Roman" w:cs="Arial" w:ascii="Arial" w:hAnsi="Arial"/>
           <w:kern w:val="0"/>
           <w:sz w:val="24"/>
           <w:szCs w:val="24"/>
@@ -587,19 +729,20 @@
     </w:p>
     <w:p>
       <w:pPr>
-        <w:spacing w:before="100" w:beforeAutospacing="1" w:after="100" w:afterAutospacing="1" w:line="240" w:lineRule="auto"/>
-        <w:rPr>
-          <w:rFonts w:ascii="Arial" w:eastAsia="Times New Roman" w:hAnsi="Arial" w:cs="Arial"/>
-          <w:kern w:val="0"/>
-          <w:sz w:val="24"/>
-          <w:szCs w:val="24"/>
-          <w:lang w:eastAsia="es-CO"/>
-          <w14:ligatures w14:val="none"/>
-        </w:rPr>
-      </w:pPr>
-      <w:r>
-        <w:rPr>
-          <w:rFonts w:ascii="Arial" w:eastAsia="Times New Roman" w:hAnsi="Arial" w:cs="Arial"/>
+        <w:pStyle w:val="Normal"/>
+        <w:spacing w:lineRule="auto" w:line="240" w:beforeAutospacing="1" w:afterAutospacing="1"/>
+        <w:rPr>
+          <w:rFonts w:ascii="Arial" w:hAnsi="Arial" w:eastAsia="Times New Roman" w:cs="Arial"/>
+          <w:kern w:val="0"/>
+          <w:sz w:val="24"/>
+          <w:szCs w:val="24"/>
+          <w:lang w:eastAsia="es-CO"/>
+          <w14:ligatures w14:val="none"/>
+        </w:rPr>
+      </w:pPr>
+      <w:r>
+        <w:rPr>
+          <w:rFonts w:eastAsia="Times New Roman" w:cs="Arial" w:ascii="Arial" w:hAnsi="Arial"/>
           <w:kern w:val="0"/>
           <w:sz w:val="24"/>
           <w:szCs w:val="24"/>
@@ -611,10 +754,15 @@
     </w:p>
     <w:p>
       <w:pPr>
-        <w:spacing w:before="100" w:beforeAutospacing="1" w:after="100" w:afterAutospacing="1" w:line="240" w:lineRule="auto"/>
+        <w:pStyle w:val="Normal"/>
+        <w:numPr>
+          <w:ilvl w:val="0"/>
+          <w:numId w:val="0"/>
+        </w:numPr>
+        <w:spacing w:lineRule="auto" w:line="240" w:beforeAutospacing="1" w:afterAutospacing="1"/>
         <w:outlineLvl w:val="1"/>
         <w:rPr>
-          <w:rFonts w:ascii="Arial" w:eastAsia="Times New Roman" w:hAnsi="Arial" w:cs="Arial"/>
+          <w:rFonts w:ascii="Arial" w:hAnsi="Arial" w:eastAsia="Times New Roman" w:cs="Arial"/>
           <w:b/>
           <w:bCs/>
           <w:kern w:val="0"/>
@@ -626,7 +774,7 @@
       </w:pPr>
       <w:r>
         <w:rPr>
-          <w:rFonts w:ascii="Arial" w:eastAsia="Times New Roman" w:hAnsi="Arial" w:cs="Arial"/>
+          <w:rFonts w:eastAsia="Times New Roman" w:cs="Arial" w:ascii="Arial" w:hAnsi="Arial"/>
           <w:b/>
           <w:bCs/>
           <w:kern w:val="0"/>
@@ -640,19 +788,20 @@
     </w:p>
     <w:p>
       <w:pPr>
-        <w:spacing w:before="100" w:beforeAutospacing="1" w:after="100" w:afterAutospacing="1" w:line="240" w:lineRule="auto"/>
-        <w:rPr>
-          <w:rFonts w:ascii="Arial" w:eastAsia="Times New Roman" w:hAnsi="Arial" w:cs="Arial"/>
-          <w:kern w:val="0"/>
-          <w:sz w:val="24"/>
-          <w:szCs w:val="24"/>
-          <w:lang w:eastAsia="es-CO"/>
-          <w14:ligatures w14:val="none"/>
-        </w:rPr>
-      </w:pPr>
-      <w:r>
-        <w:rPr>
-          <w:rFonts w:ascii="Arial" w:eastAsia="Times New Roman" w:hAnsi="Arial" w:cs="Arial"/>
+        <w:pStyle w:val="Normal"/>
+        <w:spacing w:lineRule="auto" w:line="240" w:beforeAutospacing="1" w:afterAutospacing="1"/>
+        <w:rPr>
+          <w:rFonts w:ascii="Arial" w:hAnsi="Arial" w:eastAsia="Times New Roman" w:cs="Arial"/>
+          <w:kern w:val="0"/>
+          <w:sz w:val="24"/>
+          <w:szCs w:val="24"/>
+          <w:lang w:eastAsia="es-CO"/>
+          <w14:ligatures w14:val="none"/>
+        </w:rPr>
+      </w:pPr>
+      <w:r>
+        <w:rPr>
+          <w:rFonts w:eastAsia="Times New Roman" w:cs="Arial" w:ascii="Arial" w:hAnsi="Arial"/>
           <w:kern w:val="0"/>
           <w:sz w:val="24"/>
           <w:szCs w:val="24"/>
@@ -664,23 +813,24 @@
     </w:p>
     <w:p>
       <w:pPr>
+        <w:pStyle w:val="Normal"/>
         <w:numPr>
           <w:ilvl w:val="0"/>
           <w:numId w:val="2"/>
         </w:numPr>
-        <w:spacing w:before="100" w:beforeAutospacing="1" w:after="100" w:afterAutospacing="1" w:line="240" w:lineRule="auto"/>
-        <w:rPr>
-          <w:rFonts w:ascii="Arial" w:eastAsia="Times New Roman" w:hAnsi="Arial" w:cs="Arial"/>
-          <w:kern w:val="0"/>
-          <w:sz w:val="24"/>
-          <w:szCs w:val="24"/>
-          <w:lang w:eastAsia="es-CO"/>
-          <w14:ligatures w14:val="none"/>
-        </w:rPr>
-      </w:pPr>
-      <w:r>
-        <w:rPr>
-          <w:rFonts w:ascii="Arial" w:eastAsia="Times New Roman" w:hAnsi="Arial" w:cs="Arial"/>
+        <w:spacing w:lineRule="auto" w:line="240" w:beforeAutospacing="1" w:after="0"/>
+        <w:rPr>
+          <w:rFonts w:ascii="Arial" w:hAnsi="Arial" w:eastAsia="Times New Roman" w:cs="Arial"/>
+          <w:kern w:val="0"/>
+          <w:sz w:val="24"/>
+          <w:szCs w:val="24"/>
+          <w:lang w:eastAsia="es-CO"/>
+          <w14:ligatures w14:val="none"/>
+        </w:rPr>
+      </w:pPr>
+      <w:r>
+        <w:rPr>
+          <w:rFonts w:eastAsia="Times New Roman" w:cs="Arial" w:ascii="Arial" w:hAnsi="Arial"/>
           <w:kern w:val="0"/>
           <w:sz w:val="24"/>
           <w:szCs w:val="24"/>
@@ -692,23 +842,24 @@
     </w:p>
     <w:p>
       <w:pPr>
+        <w:pStyle w:val="Normal"/>
         <w:numPr>
           <w:ilvl w:val="0"/>
           <w:numId w:val="2"/>
         </w:numPr>
-        <w:spacing w:before="100" w:beforeAutospacing="1" w:after="100" w:afterAutospacing="1" w:line="240" w:lineRule="auto"/>
-        <w:rPr>
-          <w:rFonts w:ascii="Arial" w:eastAsia="Times New Roman" w:hAnsi="Arial" w:cs="Arial"/>
-          <w:kern w:val="0"/>
-          <w:sz w:val="24"/>
-          <w:szCs w:val="24"/>
-          <w:lang w:eastAsia="es-CO"/>
-          <w14:ligatures w14:val="none"/>
-        </w:rPr>
-      </w:pPr>
-      <w:r>
-        <w:rPr>
-          <w:rFonts w:ascii="Arial" w:eastAsia="Times New Roman" w:hAnsi="Arial" w:cs="Arial"/>
+        <w:spacing w:lineRule="auto" w:line="240" w:before="0" w:after="0"/>
+        <w:rPr>
+          <w:rFonts w:ascii="Arial" w:hAnsi="Arial" w:eastAsia="Times New Roman" w:cs="Arial"/>
+          <w:kern w:val="0"/>
+          <w:sz w:val="24"/>
+          <w:szCs w:val="24"/>
+          <w:lang w:eastAsia="es-CO"/>
+          <w14:ligatures w14:val="none"/>
+        </w:rPr>
+      </w:pPr>
+      <w:r>
+        <w:rPr>
+          <w:rFonts w:eastAsia="Times New Roman" w:cs="Arial" w:ascii="Arial" w:hAnsi="Arial"/>
           <w:kern w:val="0"/>
           <w:sz w:val="24"/>
           <w:szCs w:val="24"/>
@@ -720,23 +871,24 @@
     </w:p>
     <w:p>
       <w:pPr>
+        <w:pStyle w:val="Normal"/>
         <w:numPr>
           <w:ilvl w:val="0"/>
           <w:numId w:val="2"/>
         </w:numPr>
-        <w:spacing w:before="100" w:beforeAutospacing="1" w:after="100" w:afterAutospacing="1" w:line="240" w:lineRule="auto"/>
-        <w:rPr>
-          <w:rFonts w:ascii="Arial" w:eastAsia="Times New Roman" w:hAnsi="Arial" w:cs="Arial"/>
-          <w:kern w:val="0"/>
-          <w:sz w:val="24"/>
-          <w:szCs w:val="24"/>
-          <w:lang w:eastAsia="es-CO"/>
-          <w14:ligatures w14:val="none"/>
-        </w:rPr>
-      </w:pPr>
-      <w:r>
-        <w:rPr>
-          <w:rFonts w:ascii="Arial" w:eastAsia="Times New Roman" w:hAnsi="Arial" w:cs="Arial"/>
+        <w:spacing w:lineRule="auto" w:line="240" w:before="0" w:after="0"/>
+        <w:rPr>
+          <w:rFonts w:ascii="Arial" w:hAnsi="Arial" w:eastAsia="Times New Roman" w:cs="Arial"/>
+          <w:kern w:val="0"/>
+          <w:sz w:val="24"/>
+          <w:szCs w:val="24"/>
+          <w:lang w:eastAsia="es-CO"/>
+          <w14:ligatures w14:val="none"/>
+        </w:rPr>
+      </w:pPr>
+      <w:r>
+        <w:rPr>
+          <w:rFonts w:eastAsia="Times New Roman" w:cs="Arial" w:ascii="Arial" w:hAnsi="Arial"/>
           <w:kern w:val="0"/>
           <w:sz w:val="24"/>
           <w:szCs w:val="24"/>
@@ -748,23 +900,24 @@
     </w:p>
     <w:p>
       <w:pPr>
+        <w:pStyle w:val="Normal"/>
         <w:numPr>
           <w:ilvl w:val="0"/>
           <w:numId w:val="2"/>
         </w:numPr>
-        <w:spacing w:before="100" w:beforeAutospacing="1" w:after="100" w:afterAutospacing="1" w:line="240" w:lineRule="auto"/>
-        <w:rPr>
-          <w:rFonts w:ascii="Arial" w:eastAsia="Times New Roman" w:hAnsi="Arial" w:cs="Arial"/>
-          <w:kern w:val="0"/>
-          <w:sz w:val="24"/>
-          <w:szCs w:val="24"/>
-          <w:lang w:eastAsia="es-CO"/>
-          <w14:ligatures w14:val="none"/>
-        </w:rPr>
-      </w:pPr>
-      <w:r>
-        <w:rPr>
-          <w:rFonts w:ascii="Arial" w:eastAsia="Times New Roman" w:hAnsi="Arial" w:cs="Arial"/>
+        <w:spacing w:lineRule="auto" w:line="240" w:before="0" w:after="0"/>
+        <w:rPr>
+          <w:rFonts w:ascii="Arial" w:hAnsi="Arial" w:eastAsia="Times New Roman" w:cs="Arial"/>
+          <w:kern w:val="0"/>
+          <w:sz w:val="24"/>
+          <w:szCs w:val="24"/>
+          <w:lang w:eastAsia="es-CO"/>
+          <w14:ligatures w14:val="none"/>
+        </w:rPr>
+      </w:pPr>
+      <w:r>
+        <w:rPr>
+          <w:rFonts w:eastAsia="Times New Roman" w:cs="Arial" w:ascii="Arial" w:hAnsi="Arial"/>
           <w:kern w:val="0"/>
           <w:sz w:val="24"/>
           <w:szCs w:val="24"/>
@@ -776,23 +929,24 @@
     </w:p>
     <w:p>
       <w:pPr>
+        <w:pStyle w:val="Normal"/>
         <w:numPr>
           <w:ilvl w:val="0"/>
           <w:numId w:val="2"/>
         </w:numPr>
-        <w:spacing w:before="100" w:beforeAutospacing="1" w:after="100" w:afterAutospacing="1" w:line="240" w:lineRule="auto"/>
-        <w:rPr>
-          <w:rFonts w:ascii="Arial" w:eastAsia="Times New Roman" w:hAnsi="Arial" w:cs="Arial"/>
-          <w:kern w:val="0"/>
-          <w:sz w:val="24"/>
-          <w:szCs w:val="24"/>
-          <w:lang w:eastAsia="es-CO"/>
-          <w14:ligatures w14:val="none"/>
-        </w:rPr>
-      </w:pPr>
-      <w:r>
-        <w:rPr>
-          <w:rFonts w:ascii="Arial" w:eastAsia="Times New Roman" w:hAnsi="Arial" w:cs="Arial"/>
+        <w:spacing w:lineRule="auto" w:line="240" w:before="0" w:after="0"/>
+        <w:rPr>
+          <w:rFonts w:ascii="Arial" w:hAnsi="Arial" w:eastAsia="Times New Roman" w:cs="Arial"/>
+          <w:kern w:val="0"/>
+          <w:sz w:val="24"/>
+          <w:szCs w:val="24"/>
+          <w:lang w:eastAsia="es-CO"/>
+          <w14:ligatures w14:val="none"/>
+        </w:rPr>
+      </w:pPr>
+      <w:r>
+        <w:rPr>
+          <w:rFonts w:eastAsia="Times New Roman" w:cs="Arial" w:ascii="Arial" w:hAnsi="Arial"/>
           <w:kern w:val="0"/>
           <w:sz w:val="24"/>
           <w:szCs w:val="24"/>
@@ -804,23 +958,24 @@
     </w:p>
     <w:p>
       <w:pPr>
+        <w:pStyle w:val="Normal"/>
         <w:numPr>
           <w:ilvl w:val="0"/>
           <w:numId w:val="2"/>
         </w:numPr>
-        <w:spacing w:before="100" w:beforeAutospacing="1" w:after="100" w:afterAutospacing="1" w:line="240" w:lineRule="auto"/>
-        <w:rPr>
-          <w:rFonts w:ascii="Arial" w:eastAsia="Times New Roman" w:hAnsi="Arial" w:cs="Arial"/>
-          <w:kern w:val="0"/>
-          <w:sz w:val="24"/>
-          <w:szCs w:val="24"/>
-          <w:lang w:eastAsia="es-CO"/>
-          <w14:ligatures w14:val="none"/>
-        </w:rPr>
-      </w:pPr>
-      <w:r>
-        <w:rPr>
-          <w:rFonts w:ascii="Arial" w:eastAsia="Times New Roman" w:hAnsi="Arial" w:cs="Arial"/>
+        <w:spacing w:lineRule="auto" w:line="240" w:before="0" w:after="0"/>
+        <w:rPr>
+          <w:rFonts w:ascii="Arial" w:hAnsi="Arial" w:eastAsia="Times New Roman" w:cs="Arial"/>
+          <w:kern w:val="0"/>
+          <w:sz w:val="24"/>
+          <w:szCs w:val="24"/>
+          <w:lang w:eastAsia="es-CO"/>
+          <w14:ligatures w14:val="none"/>
+        </w:rPr>
+      </w:pPr>
+      <w:r>
+        <w:rPr>
+          <w:rFonts w:eastAsia="Times New Roman" w:cs="Arial" w:ascii="Arial" w:hAnsi="Arial"/>
           <w:kern w:val="0"/>
           <w:sz w:val="24"/>
           <w:szCs w:val="24"/>
@@ -832,23 +987,24 @@
     </w:p>
     <w:p>
       <w:pPr>
+        <w:pStyle w:val="Normal"/>
         <w:numPr>
           <w:ilvl w:val="0"/>
           <w:numId w:val="2"/>
         </w:numPr>
-        <w:spacing w:before="100" w:beforeAutospacing="1" w:after="100" w:afterAutospacing="1" w:line="240" w:lineRule="auto"/>
-        <w:rPr>
-          <w:rFonts w:ascii="Arial" w:eastAsia="Times New Roman" w:hAnsi="Arial" w:cs="Arial"/>
-          <w:kern w:val="0"/>
-          <w:sz w:val="24"/>
-          <w:szCs w:val="24"/>
-          <w:lang w:eastAsia="es-CO"/>
-          <w14:ligatures w14:val="none"/>
-        </w:rPr>
-      </w:pPr>
-      <w:r>
-        <w:rPr>
-          <w:rFonts w:ascii="Arial" w:eastAsia="Times New Roman" w:hAnsi="Arial" w:cs="Arial"/>
+        <w:spacing w:lineRule="auto" w:line="240" w:before="0" w:after="0"/>
+        <w:rPr>
+          <w:rFonts w:ascii="Arial" w:hAnsi="Arial" w:eastAsia="Times New Roman" w:cs="Arial"/>
+          <w:kern w:val="0"/>
+          <w:sz w:val="24"/>
+          <w:szCs w:val="24"/>
+          <w:lang w:eastAsia="es-CO"/>
+          <w14:ligatures w14:val="none"/>
+        </w:rPr>
+      </w:pPr>
+      <w:r>
+        <w:rPr>
+          <w:rFonts w:eastAsia="Times New Roman" w:cs="Arial" w:ascii="Arial" w:hAnsi="Arial"/>
           <w:kern w:val="0"/>
           <w:sz w:val="24"/>
           <w:szCs w:val="24"/>
@@ -860,23 +1016,24 @@
     </w:p>
     <w:p>
       <w:pPr>
+        <w:pStyle w:val="Normal"/>
         <w:numPr>
           <w:ilvl w:val="0"/>
           <w:numId w:val="2"/>
         </w:numPr>
-        <w:spacing w:before="100" w:beforeAutospacing="1" w:after="100" w:afterAutospacing="1" w:line="240" w:lineRule="auto"/>
-        <w:rPr>
-          <w:rFonts w:ascii="Arial" w:eastAsia="Times New Roman" w:hAnsi="Arial" w:cs="Arial"/>
-          <w:kern w:val="0"/>
-          <w:sz w:val="24"/>
-          <w:szCs w:val="24"/>
-          <w:lang w:eastAsia="es-CO"/>
-          <w14:ligatures w14:val="none"/>
-        </w:rPr>
-      </w:pPr>
-      <w:r>
-        <w:rPr>
-          <w:rFonts w:ascii="Arial" w:eastAsia="Times New Roman" w:hAnsi="Arial" w:cs="Arial"/>
+        <w:spacing w:lineRule="auto" w:line="240" w:before="0" w:after="0"/>
+        <w:rPr>
+          <w:rFonts w:ascii="Arial" w:hAnsi="Arial" w:eastAsia="Times New Roman" w:cs="Arial"/>
+          <w:kern w:val="0"/>
+          <w:sz w:val="24"/>
+          <w:szCs w:val="24"/>
+          <w:lang w:eastAsia="es-CO"/>
+          <w14:ligatures w14:val="none"/>
+        </w:rPr>
+      </w:pPr>
+      <w:r>
+        <w:rPr>
+          <w:rFonts w:eastAsia="Times New Roman" w:cs="Arial" w:ascii="Arial" w:hAnsi="Arial"/>
           <w:kern w:val="0"/>
           <w:sz w:val="24"/>
           <w:szCs w:val="24"/>
@@ -888,23 +1045,24 @@
     </w:p>
     <w:p>
       <w:pPr>
+        <w:pStyle w:val="Normal"/>
         <w:numPr>
           <w:ilvl w:val="0"/>
           <w:numId w:val="2"/>
         </w:numPr>
-        <w:spacing w:before="100" w:beforeAutospacing="1" w:after="100" w:afterAutospacing="1" w:line="240" w:lineRule="auto"/>
-        <w:rPr>
-          <w:rFonts w:ascii="Arial" w:eastAsia="Times New Roman" w:hAnsi="Arial" w:cs="Arial"/>
-          <w:kern w:val="0"/>
-          <w:sz w:val="24"/>
-          <w:szCs w:val="24"/>
-          <w:lang w:eastAsia="es-CO"/>
-          <w14:ligatures w14:val="none"/>
-        </w:rPr>
-      </w:pPr>
-      <w:r>
-        <w:rPr>
-          <w:rFonts w:ascii="Arial" w:eastAsia="Times New Roman" w:hAnsi="Arial" w:cs="Arial"/>
+        <w:spacing w:lineRule="auto" w:line="240" w:before="0" w:after="0"/>
+        <w:rPr>
+          <w:rFonts w:ascii="Arial" w:hAnsi="Arial" w:eastAsia="Times New Roman" w:cs="Arial"/>
+          <w:kern w:val="0"/>
+          <w:sz w:val="24"/>
+          <w:szCs w:val="24"/>
+          <w:lang w:eastAsia="es-CO"/>
+          <w14:ligatures w14:val="none"/>
+        </w:rPr>
+      </w:pPr>
+      <w:r>
+        <w:rPr>
+          <w:rFonts w:eastAsia="Times New Roman" w:cs="Arial" w:ascii="Arial" w:hAnsi="Arial"/>
           <w:kern w:val="0"/>
           <w:sz w:val="24"/>
           <w:szCs w:val="24"/>
@@ -916,23 +1074,24 @@
     </w:p>
     <w:p>
       <w:pPr>
+        <w:pStyle w:val="Normal"/>
         <w:numPr>
           <w:ilvl w:val="0"/>
           <w:numId w:val="2"/>
         </w:numPr>
-        <w:spacing w:before="100" w:beforeAutospacing="1" w:after="100" w:afterAutospacing="1" w:line="240" w:lineRule="auto"/>
-        <w:rPr>
-          <w:rFonts w:ascii="Arial" w:eastAsia="Times New Roman" w:hAnsi="Arial" w:cs="Arial"/>
-          <w:kern w:val="0"/>
-          <w:sz w:val="24"/>
-          <w:szCs w:val="24"/>
-          <w:lang w:eastAsia="es-CO"/>
-          <w14:ligatures w14:val="none"/>
-        </w:rPr>
-      </w:pPr>
-      <w:r>
-        <w:rPr>
-          <w:rFonts w:ascii="Arial" w:eastAsia="Times New Roman" w:hAnsi="Arial" w:cs="Arial"/>
+        <w:spacing w:lineRule="auto" w:line="240" w:before="0" w:after="0"/>
+        <w:rPr>
+          <w:rFonts w:ascii="Arial" w:hAnsi="Arial" w:eastAsia="Times New Roman" w:cs="Arial"/>
+          <w:kern w:val="0"/>
+          <w:sz w:val="24"/>
+          <w:szCs w:val="24"/>
+          <w:lang w:eastAsia="es-CO"/>
+          <w14:ligatures w14:val="none"/>
+        </w:rPr>
+      </w:pPr>
+      <w:r>
+        <w:rPr>
+          <w:rFonts w:eastAsia="Times New Roman" w:cs="Arial" w:ascii="Arial" w:hAnsi="Arial"/>
           <w:kern w:val="0"/>
           <w:sz w:val="24"/>
           <w:szCs w:val="24"/>
@@ -944,23 +1103,24 @@
     </w:p>
     <w:p>
       <w:pPr>
+        <w:pStyle w:val="Normal"/>
         <w:numPr>
           <w:ilvl w:val="0"/>
           <w:numId w:val="2"/>
         </w:numPr>
-        <w:spacing w:before="100" w:beforeAutospacing="1" w:after="100" w:afterAutospacing="1" w:line="240" w:lineRule="auto"/>
-        <w:rPr>
-          <w:rFonts w:ascii="Arial" w:eastAsia="Times New Roman" w:hAnsi="Arial" w:cs="Arial"/>
-          <w:kern w:val="0"/>
-          <w:sz w:val="24"/>
-          <w:szCs w:val="24"/>
-          <w:lang w:eastAsia="es-CO"/>
-          <w14:ligatures w14:val="none"/>
-        </w:rPr>
-      </w:pPr>
-      <w:r>
-        <w:rPr>
-          <w:rFonts w:ascii="Arial" w:eastAsia="Times New Roman" w:hAnsi="Arial" w:cs="Arial"/>
+        <w:spacing w:lineRule="auto" w:line="240" w:before="0" w:afterAutospacing="1"/>
+        <w:rPr>
+          <w:rFonts w:ascii="Arial" w:hAnsi="Arial" w:eastAsia="Times New Roman" w:cs="Arial"/>
+          <w:kern w:val="0"/>
+          <w:sz w:val="24"/>
+          <w:szCs w:val="24"/>
+          <w:lang w:eastAsia="es-CO"/>
+          <w14:ligatures w14:val="none"/>
+        </w:rPr>
+      </w:pPr>
+      <w:r>
+        <w:rPr>
+          <w:rFonts w:eastAsia="Times New Roman" w:cs="Arial" w:ascii="Arial" w:hAnsi="Arial"/>
           <w:kern w:val="0"/>
           <w:sz w:val="24"/>
           <w:szCs w:val="24"/>
@@ -972,10 +1132,15 @@
     </w:p>
     <w:p>
       <w:pPr>
-        <w:spacing w:before="100" w:beforeAutospacing="1" w:after="100" w:afterAutospacing="1" w:line="240" w:lineRule="auto"/>
+        <w:pStyle w:val="Normal"/>
+        <w:numPr>
+          <w:ilvl w:val="0"/>
+          <w:numId w:val="0"/>
+        </w:numPr>
+        <w:spacing w:lineRule="auto" w:line="240" w:beforeAutospacing="1" w:afterAutospacing="1"/>
         <w:outlineLvl w:val="1"/>
         <w:rPr>
-          <w:rFonts w:ascii="Arial" w:eastAsia="Times New Roman" w:hAnsi="Arial" w:cs="Arial"/>
+          <w:rFonts w:ascii="Arial" w:hAnsi="Arial" w:eastAsia="Times New Roman" w:cs="Arial"/>
           <w:b/>
           <w:bCs/>
           <w:kern w:val="0"/>
@@ -987,7 +1152,7 @@
       </w:pPr>
       <w:r>
         <w:rPr>
-          <w:rFonts w:ascii="Arial" w:eastAsia="Times New Roman" w:hAnsi="Arial" w:cs="Arial"/>
+          <w:rFonts w:eastAsia="Times New Roman" w:cs="Arial" w:ascii="Arial" w:hAnsi="Arial"/>
           <w:b/>
           <w:bCs/>
           <w:kern w:val="0"/>
@@ -1001,19 +1166,20 @@
     </w:p>
     <w:p>
       <w:pPr>
-        <w:spacing w:before="100" w:beforeAutospacing="1" w:after="100" w:afterAutospacing="1" w:line="240" w:lineRule="auto"/>
-        <w:rPr>
-          <w:rFonts w:ascii="Arial" w:eastAsia="Times New Roman" w:hAnsi="Arial" w:cs="Arial"/>
-          <w:kern w:val="0"/>
-          <w:sz w:val="24"/>
-          <w:szCs w:val="24"/>
-          <w:lang w:eastAsia="es-CO"/>
-          <w14:ligatures w14:val="none"/>
-        </w:rPr>
-      </w:pPr>
-      <w:r>
-        <w:rPr>
-          <w:rFonts w:ascii="Arial" w:eastAsia="Times New Roman" w:hAnsi="Arial" w:cs="Arial"/>
+        <w:pStyle w:val="Normal"/>
+        <w:spacing w:lineRule="auto" w:line="240" w:beforeAutospacing="1" w:afterAutospacing="1"/>
+        <w:rPr>
+          <w:rFonts w:ascii="Arial" w:hAnsi="Arial" w:eastAsia="Times New Roman" w:cs="Arial"/>
+          <w:kern w:val="0"/>
+          <w:sz w:val="24"/>
+          <w:szCs w:val="24"/>
+          <w:lang w:eastAsia="es-CO"/>
+          <w14:ligatures w14:val="none"/>
+        </w:rPr>
+      </w:pPr>
+      <w:r>
+        <w:rPr>
+          <w:rFonts w:eastAsia="Times New Roman" w:cs="Arial" w:ascii="Arial" w:hAnsi="Arial"/>
           <w:kern w:val="0"/>
           <w:sz w:val="24"/>
           <w:szCs w:val="24"/>
@@ -1025,52 +1191,53 @@
     </w:p>
     <w:p>
       <w:pPr>
+        <w:pStyle w:val="Normal"/>
         <w:numPr>
           <w:ilvl w:val="0"/>
           <w:numId w:val="3"/>
         </w:numPr>
-        <w:spacing w:before="100" w:beforeAutospacing="1" w:after="100" w:afterAutospacing="1" w:line="240" w:lineRule="auto"/>
-        <w:rPr>
-          <w:rFonts w:ascii="Arial" w:eastAsia="Times New Roman" w:hAnsi="Arial" w:cs="Arial"/>
-          <w:kern w:val="0"/>
-          <w:sz w:val="24"/>
-          <w:szCs w:val="24"/>
-          <w:lang w:eastAsia="es-CO"/>
-          <w14:ligatures w14:val="none"/>
-        </w:rPr>
-      </w:pPr>
-      <w:r>
-        <w:rPr>
-          <w:rFonts w:ascii="Arial" w:eastAsia="Times New Roman" w:hAnsi="Arial" w:cs="Arial"/>
-          <w:kern w:val="0"/>
-          <w:sz w:val="24"/>
-          <w:szCs w:val="24"/>
-          <w:lang w:eastAsia="es-CO"/>
-          <w14:ligatures w14:val="none"/>
-        </w:rPr>
-        <w:lastRenderedPageBreak/>
+        <w:spacing w:lineRule="auto" w:line="240" w:beforeAutospacing="1" w:after="0"/>
+        <w:rPr>
+          <w:rFonts w:ascii="Arial" w:hAnsi="Arial" w:eastAsia="Times New Roman" w:cs="Arial"/>
+          <w:kern w:val="0"/>
+          <w:sz w:val="24"/>
+          <w:szCs w:val="24"/>
+          <w:lang w:eastAsia="es-CO"/>
+          <w14:ligatures w14:val="none"/>
+        </w:rPr>
+      </w:pPr>
+      <w:r>
+        <w:rPr>
+          <w:rFonts w:eastAsia="Times New Roman" w:cs="Arial" w:ascii="Arial" w:hAnsi="Arial"/>
+          <w:kern w:val="0"/>
+          <w:sz w:val="24"/>
+          <w:szCs w:val="24"/>
+          <w:lang w:eastAsia="es-CO"/>
+          <w14:ligatures w14:val="none"/>
+        </w:rPr>
         <w:t>El sistema no reemplazará la valoración o consulta realizada por un nutricionista profesional.</w:t>
       </w:r>
     </w:p>
     <w:p>
       <w:pPr>
+        <w:pStyle w:val="Normal"/>
         <w:numPr>
           <w:ilvl w:val="0"/>
           <w:numId w:val="3"/>
         </w:numPr>
-        <w:spacing w:before="100" w:beforeAutospacing="1" w:after="100" w:afterAutospacing="1" w:line="240" w:lineRule="auto"/>
-        <w:rPr>
-          <w:rFonts w:ascii="Arial" w:eastAsia="Times New Roman" w:hAnsi="Arial" w:cs="Arial"/>
-          <w:kern w:val="0"/>
-          <w:sz w:val="24"/>
-          <w:szCs w:val="24"/>
-          <w:lang w:eastAsia="es-CO"/>
-          <w14:ligatures w14:val="none"/>
-        </w:rPr>
-      </w:pPr>
-      <w:r>
-        <w:rPr>
-          <w:rFonts w:ascii="Arial" w:eastAsia="Times New Roman" w:hAnsi="Arial" w:cs="Arial"/>
+        <w:spacing w:lineRule="auto" w:line="240" w:before="0" w:after="0"/>
+        <w:rPr>
+          <w:rFonts w:ascii="Arial" w:hAnsi="Arial" w:eastAsia="Times New Roman" w:cs="Arial"/>
+          <w:kern w:val="0"/>
+          <w:sz w:val="24"/>
+          <w:szCs w:val="24"/>
+          <w:lang w:eastAsia="es-CO"/>
+          <w14:ligatures w14:val="none"/>
+        </w:rPr>
+      </w:pPr>
+      <w:r>
+        <w:rPr>
+          <w:rFonts w:eastAsia="Times New Roman" w:cs="Arial" w:ascii="Arial" w:hAnsi="Arial"/>
           <w:kern w:val="0"/>
           <w:sz w:val="24"/>
           <w:szCs w:val="24"/>
@@ -1082,23 +1249,24 @@
     </w:p>
     <w:p>
       <w:pPr>
+        <w:pStyle w:val="Normal"/>
         <w:numPr>
           <w:ilvl w:val="0"/>
           <w:numId w:val="3"/>
         </w:numPr>
-        <w:spacing w:before="100" w:beforeAutospacing="1" w:after="100" w:afterAutospacing="1" w:line="240" w:lineRule="auto"/>
-        <w:rPr>
-          <w:rFonts w:ascii="Arial" w:eastAsia="Times New Roman" w:hAnsi="Arial" w:cs="Arial"/>
-          <w:kern w:val="0"/>
-          <w:sz w:val="24"/>
-          <w:szCs w:val="24"/>
-          <w:lang w:eastAsia="es-CO"/>
-          <w14:ligatures w14:val="none"/>
-        </w:rPr>
-      </w:pPr>
-      <w:r>
-        <w:rPr>
-          <w:rFonts w:ascii="Arial" w:eastAsia="Times New Roman" w:hAnsi="Arial" w:cs="Arial"/>
+        <w:spacing w:lineRule="auto" w:line="240" w:before="0" w:after="0"/>
+        <w:rPr>
+          <w:rFonts w:ascii="Arial" w:hAnsi="Arial" w:eastAsia="Times New Roman" w:cs="Arial"/>
+          <w:kern w:val="0"/>
+          <w:sz w:val="24"/>
+          <w:szCs w:val="24"/>
+          <w:lang w:eastAsia="es-CO"/>
+          <w14:ligatures w14:val="none"/>
+        </w:rPr>
+      </w:pPr>
+      <w:r>
+        <w:rPr>
+          <w:rFonts w:eastAsia="Times New Roman" w:cs="Arial" w:ascii="Arial" w:hAnsi="Arial"/>
           <w:kern w:val="0"/>
           <w:sz w:val="24"/>
           <w:szCs w:val="24"/>
@@ -1110,23 +1278,24 @@
     </w:p>
     <w:p>
       <w:pPr>
+        <w:pStyle w:val="Normal"/>
         <w:numPr>
           <w:ilvl w:val="0"/>
           <w:numId w:val="3"/>
         </w:numPr>
-        <w:spacing w:before="100" w:beforeAutospacing="1" w:after="100" w:afterAutospacing="1" w:line="240" w:lineRule="auto"/>
-        <w:rPr>
-          <w:rFonts w:ascii="Arial" w:eastAsia="Times New Roman" w:hAnsi="Arial" w:cs="Arial"/>
-          <w:kern w:val="0"/>
-          <w:sz w:val="24"/>
-          <w:szCs w:val="24"/>
-          <w:lang w:eastAsia="es-CO"/>
-          <w14:ligatures w14:val="none"/>
-        </w:rPr>
-      </w:pPr>
-      <w:r>
-        <w:rPr>
-          <w:rFonts w:ascii="Arial" w:eastAsia="Times New Roman" w:hAnsi="Arial" w:cs="Arial"/>
+        <w:spacing w:lineRule="auto" w:line="240" w:before="0" w:after="0"/>
+        <w:rPr>
+          <w:rFonts w:ascii="Arial" w:hAnsi="Arial" w:eastAsia="Times New Roman" w:cs="Arial"/>
+          <w:kern w:val="0"/>
+          <w:sz w:val="24"/>
+          <w:szCs w:val="24"/>
+          <w:lang w:eastAsia="es-CO"/>
+          <w14:ligatures w14:val="none"/>
+        </w:rPr>
+      </w:pPr>
+      <w:r>
+        <w:rPr>
+          <w:rFonts w:eastAsia="Times New Roman" w:cs="Arial" w:ascii="Arial" w:hAnsi="Arial"/>
           <w:kern w:val="0"/>
           <w:sz w:val="24"/>
           <w:szCs w:val="24"/>
@@ -1138,23 +1307,24 @@
     </w:p>
     <w:p>
       <w:pPr>
+        <w:pStyle w:val="Normal"/>
         <w:numPr>
           <w:ilvl w:val="0"/>
           <w:numId w:val="3"/>
         </w:numPr>
-        <w:spacing w:before="100" w:beforeAutospacing="1" w:after="100" w:afterAutospacing="1" w:line="240" w:lineRule="auto"/>
-        <w:rPr>
-          <w:rFonts w:ascii="Arial" w:eastAsia="Times New Roman" w:hAnsi="Arial" w:cs="Arial"/>
-          <w:kern w:val="0"/>
-          <w:sz w:val="24"/>
-          <w:szCs w:val="24"/>
-          <w:lang w:eastAsia="es-CO"/>
-          <w14:ligatures w14:val="none"/>
-        </w:rPr>
-      </w:pPr>
-      <w:r>
-        <w:rPr>
-          <w:rFonts w:ascii="Arial" w:eastAsia="Times New Roman" w:hAnsi="Arial" w:cs="Arial"/>
+        <w:spacing w:lineRule="auto" w:line="240" w:before="0" w:after="0"/>
+        <w:rPr>
+          <w:rFonts w:ascii="Arial" w:hAnsi="Arial" w:eastAsia="Times New Roman" w:cs="Arial"/>
+          <w:kern w:val="0"/>
+          <w:sz w:val="24"/>
+          <w:szCs w:val="24"/>
+          <w:lang w:eastAsia="es-CO"/>
+          <w14:ligatures w14:val="none"/>
+        </w:rPr>
+      </w:pPr>
+      <w:r>
+        <w:rPr>
+          <w:rFonts w:eastAsia="Times New Roman" w:cs="Arial" w:ascii="Arial" w:hAnsi="Arial"/>
           <w:kern w:val="0"/>
           <w:sz w:val="24"/>
           <w:szCs w:val="24"/>
@@ -1166,23 +1336,24 @@
     </w:p>
     <w:p>
       <w:pPr>
+        <w:pStyle w:val="Normal"/>
         <w:numPr>
           <w:ilvl w:val="0"/>
           <w:numId w:val="3"/>
         </w:numPr>
-        <w:spacing w:before="100" w:beforeAutospacing="1" w:after="100" w:afterAutospacing="1" w:line="240" w:lineRule="auto"/>
-        <w:rPr>
-          <w:rFonts w:ascii="Arial" w:eastAsia="Times New Roman" w:hAnsi="Arial" w:cs="Arial"/>
-          <w:kern w:val="0"/>
-          <w:sz w:val="24"/>
-          <w:szCs w:val="24"/>
-          <w:lang w:eastAsia="es-CO"/>
-          <w14:ligatures w14:val="none"/>
-        </w:rPr>
-      </w:pPr>
-      <w:r>
-        <w:rPr>
-          <w:rFonts w:ascii="Arial" w:eastAsia="Times New Roman" w:hAnsi="Arial" w:cs="Arial"/>
+        <w:spacing w:lineRule="auto" w:line="240" w:before="0" w:after="0"/>
+        <w:rPr>
+          <w:rFonts w:ascii="Arial" w:hAnsi="Arial" w:eastAsia="Times New Roman" w:cs="Arial"/>
+          <w:kern w:val="0"/>
+          <w:sz w:val="24"/>
+          <w:szCs w:val="24"/>
+          <w:lang w:eastAsia="es-CO"/>
+          <w14:ligatures w14:val="none"/>
+        </w:rPr>
+      </w:pPr>
+      <w:r>
+        <w:rPr>
+          <w:rFonts w:eastAsia="Times New Roman" w:cs="Arial" w:ascii="Arial" w:hAnsi="Arial"/>
           <w:kern w:val="0"/>
           <w:sz w:val="24"/>
           <w:szCs w:val="24"/>
@@ -1194,23 +1365,24 @@
     </w:p>
     <w:p>
       <w:pPr>
+        <w:pStyle w:val="Normal"/>
         <w:numPr>
           <w:ilvl w:val="0"/>
           <w:numId w:val="3"/>
         </w:numPr>
-        <w:spacing w:before="100" w:beforeAutospacing="1" w:after="100" w:afterAutospacing="1" w:line="240" w:lineRule="auto"/>
-        <w:rPr>
-          <w:rFonts w:ascii="Arial" w:eastAsia="Times New Roman" w:hAnsi="Arial" w:cs="Arial"/>
-          <w:kern w:val="0"/>
-          <w:sz w:val="24"/>
-          <w:szCs w:val="24"/>
-          <w:lang w:eastAsia="es-CO"/>
-          <w14:ligatures w14:val="none"/>
-        </w:rPr>
-      </w:pPr>
-      <w:r>
-        <w:rPr>
-          <w:rFonts w:ascii="Arial" w:eastAsia="Times New Roman" w:hAnsi="Arial" w:cs="Arial"/>
+        <w:spacing w:lineRule="auto" w:line="240" w:before="0" w:after="0"/>
+        <w:rPr>
+          <w:rFonts w:ascii="Arial" w:hAnsi="Arial" w:eastAsia="Times New Roman" w:cs="Arial"/>
+          <w:kern w:val="0"/>
+          <w:sz w:val="24"/>
+          <w:szCs w:val="24"/>
+          <w:lang w:eastAsia="es-CO"/>
+          <w14:ligatures w14:val="none"/>
+        </w:rPr>
+      </w:pPr>
+      <w:r>
+        <w:rPr>
+          <w:rFonts w:eastAsia="Times New Roman" w:cs="Arial" w:ascii="Arial" w:hAnsi="Arial"/>
           <w:kern w:val="0"/>
           <w:sz w:val="24"/>
           <w:szCs w:val="24"/>
@@ -1222,23 +1394,24 @@
     </w:p>
     <w:p>
       <w:pPr>
+        <w:pStyle w:val="Normal"/>
         <w:numPr>
           <w:ilvl w:val="0"/>
           <w:numId w:val="3"/>
         </w:numPr>
-        <w:spacing w:before="100" w:beforeAutospacing="1" w:after="100" w:afterAutospacing="1" w:line="240" w:lineRule="auto"/>
-        <w:rPr>
-          <w:rFonts w:ascii="Arial" w:eastAsia="Times New Roman" w:hAnsi="Arial" w:cs="Arial"/>
-          <w:kern w:val="0"/>
-          <w:sz w:val="24"/>
-          <w:szCs w:val="24"/>
-          <w:lang w:eastAsia="es-CO"/>
-          <w14:ligatures w14:val="none"/>
-        </w:rPr>
-      </w:pPr>
-      <w:r>
-        <w:rPr>
-          <w:rFonts w:ascii="Arial" w:eastAsia="Times New Roman" w:hAnsi="Arial" w:cs="Arial"/>
+        <w:spacing w:lineRule="auto" w:line="240" w:before="0" w:afterAutospacing="1"/>
+        <w:rPr>
+          <w:rFonts w:ascii="Arial" w:hAnsi="Arial" w:eastAsia="Times New Roman" w:cs="Arial"/>
+          <w:kern w:val="0"/>
+          <w:sz w:val="24"/>
+          <w:szCs w:val="24"/>
+          <w:lang w:eastAsia="es-CO"/>
+          <w14:ligatures w14:val="none"/>
+        </w:rPr>
+      </w:pPr>
+      <w:r>
+        <w:rPr>
+          <w:rFonts w:eastAsia="Times New Roman" w:cs="Arial" w:ascii="Arial" w:hAnsi="Arial"/>
           <w:kern w:val="0"/>
           <w:sz w:val="24"/>
           <w:szCs w:val="24"/>
@@ -1247,494 +1420,940 @@
         </w:rPr>
         <w:t>Las recomendaciones generadas por el sistema tendrán un carácter informativo y general, por lo que no sustituirán la orientación de un profesional de la salud.</w:t>
       </w:r>
-    </w:p>
-    <w:p>
-      <w:pPr>
-        <w:jc w:val="center"/>
-        <w:rPr>
-          <w:rFonts w:ascii="Arial" w:hAnsi="Arial" w:cs="Arial"/>
-          <w:sz w:val="28"/>
-          <w:szCs w:val="28"/>
-        </w:rPr>
-      </w:pPr>
+      <w:r>
+        <w:br w:type="page"/>
+      </w:r>
+    </w:p>
+    <w:p>
+      <w:pPr>
+        <w:pStyle w:val="Normal"/>
+        <w:numPr>
+          <w:ilvl w:val="0"/>
+          <w:numId w:val="0"/>
+        </w:numPr>
+        <w:bidi w:val="0"/>
+        <w:spacing w:lineRule="auto" w:line="240" w:before="0" w:afterAutospacing="1"/>
+        <w:ind w:hanging="0" w:start="720"/>
+        <w:rPr>
+          <w:rFonts w:ascii="Arial" w:hAnsi="Arial" w:eastAsia="Times New Roman" w:cs="Arial"/>
+          <w:kern w:val="0"/>
+          <w:sz w:val="24"/>
+          <w:szCs w:val="24"/>
+          <w:lang w:eastAsia="es-CO"/>
+          <w14:ligatures w14:val="none"/>
+        </w:rPr>
+      </w:pPr>
+      <w:r>
+        <w:rPr>
+          <w:rFonts w:eastAsia="Times New Roman" w:cs="Arial" w:ascii="Arial" w:hAnsi="Arial"/>
+          <w:kern w:val="0"/>
+          <w:sz w:val="24"/>
+          <w:szCs w:val="24"/>
+          <w:lang w:eastAsia="es-CO"/>
+          <w14:ligatures w14:val="none"/>
+        </w:rPr>
+        <w:t>Diagrama de Clases</w:t>
+      </w:r>
+    </w:p>
+    <w:p>
+      <w:pPr>
+        <w:pStyle w:val="Normal"/>
+        <w:numPr>
+          <w:ilvl w:val="0"/>
+          <w:numId w:val="0"/>
+        </w:numPr>
+        <w:bidi w:val="0"/>
+        <w:spacing w:lineRule="auto" w:line="240" w:before="0" w:afterAutospacing="1"/>
+        <w:ind w:hanging="0" w:start="720"/>
+        <w:rPr>
+          <w:rFonts w:ascii="Arial" w:hAnsi="Arial" w:eastAsia="Times New Roman" w:cs="Arial"/>
+          <w:kern w:val="0"/>
+          <w:sz w:val="24"/>
+          <w:szCs w:val="24"/>
+          <w:lang w:eastAsia="es-CO"/>
+          <w14:ligatures w14:val="none"/>
+        </w:rPr>
+      </w:pPr>
+      <w:r>
+        <w:rPr>
+          <w:rFonts w:eastAsia="Times New Roman" w:cs="Arial" w:ascii="Arial" w:hAnsi="Arial"/>
+          <w:kern w:val="0"/>
+          <w:sz w:val="24"/>
+          <w:szCs w:val="24"/>
+          <w:lang w:eastAsia="es-CO"/>
+          <w14:ligatures w14:val="none"/>
+        </w:rPr>
+        <w:t>Ilustración 1 - Diagrama de Clases</w:t>
+      </w:r>
+    </w:p>
+    <w:p>
+      <w:pPr>
+        <w:pStyle w:val="Normal"/>
+        <w:bidi w:val="0"/>
+        <w:spacing w:lineRule="auto" w:line="240" w:before="0" w:afterAutospacing="1"/>
+        <w:rPr>
+          <w:rFonts w:ascii="Arial" w:hAnsi="Arial" w:eastAsia="Times New Roman" w:cs="Arial"/>
+          <w:kern w:val="0"/>
+          <w:sz w:val="24"/>
+          <w:szCs w:val="24"/>
+          <w:lang w:eastAsia="es-CO"/>
+          <w14:ligatures w14:val="none"/>
+        </w:rPr>
+      </w:pPr>
+      <w:r>
+        <w:drawing>
+          <wp:anchor distT="0" distB="0" distL="0" distR="0" simplePos="0" relativeHeight="2" behindDoc="0" locked="0" layoutInCell="0" allowOverlap="1">
+            <wp:simplePos x="0" y="0"/>
+            <wp:positionH relativeFrom="column">
+              <wp:align>center</wp:align>
+            </wp:positionH>
+            <wp:positionV relativeFrom="paragraph">
+              <wp:posOffset>635</wp:posOffset>
+            </wp:positionV>
+            <wp:extent cx="5383530" cy="2566035"/>
+            <wp:effectExtent l="0" t="0" r="0" b="0"/>
+            <wp:wrapSquare wrapText="largest"/>
+            <wp:docPr id="1" name="Image1"/>
+            <wp:cNvGraphicFramePr>
+              <a:graphicFrameLocks xmlns:a="http://schemas.openxmlformats.org/drawingml/2006/main" noChangeAspect="1"/>
+            </wp:cNvGraphicFramePr>
+            <a:graphic xmlns:a="http://schemas.openxmlformats.org/drawingml/2006/main">
+              <a:graphicData uri="http://schemas.openxmlformats.org/drawingml/2006/picture">
+                <pic:pic xmlns:pic="http://schemas.openxmlformats.org/drawingml/2006/picture">
+                  <pic:nvPicPr>
+                    <pic:cNvPr id="1" name="Image1"/>
+                    <pic:cNvPicPr>
+                      <a:picLocks noChangeAspect="1" noChangeArrowheads="1"/>
+                    </pic:cNvPicPr>
+                  </pic:nvPicPr>
+                  <pic:blipFill>
+                    <a:blip r:embed="rId2"/>
+                    <a:stretch>
+                      <a:fillRect/>
+                    </a:stretch>
+                  </pic:blipFill>
+                  <pic:spPr bwMode="auto">
+                    <a:xfrm>
+                      <a:off x="0" y="0"/>
+                      <a:ext cx="5383530" cy="2566035"/>
+                    </a:xfrm>
+                    <a:prstGeom prst="rect">
+                      <a:avLst/>
+                    </a:prstGeom>
+                    <a:noFill/>
+                  </pic:spPr>
+                </pic:pic>
+              </a:graphicData>
+            </a:graphic>
+          </wp:anchor>
+        </w:drawing>
+      </w:r>
+      <w:r>
+        <w:rPr>
+          <w:rFonts w:eastAsia="Times New Roman" w:cs="Arial" w:ascii="Arial" w:hAnsi="Arial"/>
+          <w:kern w:val="0"/>
+          <w:sz w:val="24"/>
+          <w:szCs w:val="24"/>
+          <w:lang w:eastAsia="es-CO"/>
+          <w14:ligatures w14:val="none"/>
+        </w:rPr>
+        <w:t xml:space="preserve">                          </w:t>
+      </w:r>
+    </w:p>
+    <w:p>
+      <w:pPr>
+        <w:pStyle w:val="Normal"/>
+        <w:bidi w:val="0"/>
+        <w:spacing w:lineRule="auto" w:line="240" w:before="0" w:afterAutospacing="1"/>
+        <w:rPr>
+          <w:rFonts w:ascii="Arial" w:hAnsi="Arial" w:eastAsia="Times New Roman" w:cs="Arial"/>
+          <w:kern w:val="0"/>
+          <w:sz w:val="24"/>
+          <w:szCs w:val="24"/>
+          <w:lang w:eastAsia="es-CO"/>
+          <w14:ligatures w14:val="none"/>
+        </w:rPr>
+      </w:pPr>
+      <w:r>
+        <w:rPr>
+          <w:rFonts w:eastAsia="Times New Roman" w:cs="Arial" w:ascii="Arial" w:hAnsi="Arial"/>
+          <w:kern w:val="0"/>
+          <w:sz w:val="24"/>
+          <w:szCs w:val="24"/>
+          <w:lang w:eastAsia="es-CO"/>
+          <w14:ligatures w14:val="none"/>
+        </w:rPr>
+      </w:r>
+    </w:p>
+    <w:p>
+      <w:pPr>
+        <w:pStyle w:val="Normal"/>
+        <w:bidi w:val="0"/>
+        <w:spacing w:lineRule="auto" w:line="240" w:before="0" w:afterAutospacing="1"/>
+        <w:rPr>
+          <w:rFonts w:ascii="Arial" w:hAnsi="Arial" w:eastAsia="Times New Roman" w:cs="Arial"/>
+          <w:kern w:val="0"/>
+          <w:sz w:val="24"/>
+          <w:szCs w:val="24"/>
+          <w:lang w:eastAsia="es-CO"/>
+          <w14:ligatures w14:val="none"/>
+        </w:rPr>
+      </w:pPr>
+      <w:r>
+        <w:rPr>
+          <w:rFonts w:eastAsia="Times New Roman" w:cs="Arial" w:ascii="Arial" w:hAnsi="Arial"/>
+          <w:kern w:val="0"/>
+          <w:sz w:val="24"/>
+          <w:szCs w:val="24"/>
+          <w:lang w:eastAsia="es-CO"/>
+          <w14:ligatures w14:val="none"/>
+        </w:rPr>
+      </w:r>
+    </w:p>
+    <w:p>
+      <w:pPr>
+        <w:pStyle w:val="Normal"/>
+        <w:bidi w:val="0"/>
+        <w:spacing w:lineRule="auto" w:line="240" w:before="0" w:afterAutospacing="1"/>
+        <w:rPr>
+          <w:rFonts w:ascii="Arial" w:hAnsi="Arial" w:eastAsia="Times New Roman" w:cs="Arial"/>
+          <w:kern w:val="0"/>
+          <w:sz w:val="24"/>
+          <w:szCs w:val="24"/>
+          <w:lang w:eastAsia="es-CO"/>
+          <w14:ligatures w14:val="none"/>
+        </w:rPr>
+      </w:pPr>
+      <w:r>
+        <w:rPr>
+          <w:rFonts w:eastAsia="Times New Roman" w:cs="Arial" w:ascii="Arial" w:hAnsi="Arial"/>
+          <w:kern w:val="0"/>
+          <w:sz w:val="24"/>
+          <w:szCs w:val="24"/>
+          <w:lang w:eastAsia="es-CO"/>
+          <w14:ligatures w14:val="none"/>
+        </w:rPr>
+      </w:r>
+      <w:r>
+        <w:br w:type="page"/>
+      </w:r>
+    </w:p>
+    <w:p>
+      <w:pPr>
+        <w:pStyle w:val="Normal"/>
+        <w:bidi w:val="0"/>
+        <w:spacing w:lineRule="auto" w:line="240" w:before="0" w:afterAutospacing="1"/>
+        <w:rPr>
+          <w:rFonts w:ascii="Arial" w:hAnsi="Arial" w:eastAsia="Times New Roman" w:cs="Arial"/>
+          <w:kern w:val="0"/>
+          <w:sz w:val="24"/>
+          <w:szCs w:val="24"/>
+          <w:lang w:eastAsia="es-CO"/>
+          <w14:ligatures w14:val="none"/>
+        </w:rPr>
+      </w:pPr>
+      <w:r>
+        <w:rPr>
+          <w:rFonts w:eastAsia="Times New Roman" w:cs="Arial" w:ascii="Arial" w:hAnsi="Arial"/>
+          <w:kern w:val="0"/>
+          <w:sz w:val="24"/>
+          <w:szCs w:val="24"/>
+          <w:lang w:eastAsia="es-CO"/>
+          <w14:ligatures w14:val="none"/>
+        </w:rPr>
+        <w:t>Diagrama Modelo Relacional</w:t>
+      </w:r>
+    </w:p>
+    <w:p>
+      <w:pPr>
+        <w:pStyle w:val="Normal"/>
+        <w:bidi w:val="0"/>
+        <w:spacing w:lineRule="auto" w:line="240" w:before="0" w:afterAutospacing="1"/>
+        <w:rPr>
+          <w:rFonts w:ascii="Arial" w:hAnsi="Arial" w:eastAsia="Times New Roman" w:cs="Arial"/>
+          <w:kern w:val="0"/>
+          <w:sz w:val="24"/>
+          <w:szCs w:val="24"/>
+          <w:lang w:eastAsia="es-CO"/>
+          <w14:ligatures w14:val="none"/>
+        </w:rPr>
+      </w:pPr>
+      <w:r>
+        <w:rPr>
+          <w:rFonts w:eastAsia="Times New Roman" w:cs="Arial" w:ascii="Arial" w:hAnsi="Arial"/>
+          <w:kern w:val="0"/>
+          <w:sz w:val="24"/>
+          <w:szCs w:val="24"/>
+          <w:lang w:eastAsia="es-CO"/>
+          <w14:ligatures w14:val="none"/>
+        </w:rPr>
+        <w:t>Ilustración 2 - Diagrama Modelo Relacional</w:t>
+      </w:r>
+    </w:p>
+    <w:p>
+      <w:pPr>
+        <w:pStyle w:val="Normal"/>
+        <w:bidi w:val="0"/>
+        <w:spacing w:lineRule="auto" w:line="240" w:before="0" w:afterAutospacing="1"/>
+        <w:rPr>
+          <w:rFonts w:ascii="Arial" w:hAnsi="Arial" w:eastAsia="Times New Roman" w:cs="Arial"/>
+          <w:kern w:val="0"/>
+          <w:sz w:val="24"/>
+          <w:szCs w:val="24"/>
+          <w:lang w:eastAsia="es-CO"/>
+          <w14:ligatures w14:val="none"/>
+        </w:rPr>
+      </w:pPr>
+      <w:r>
+        <w:rPr>
+          <w:rFonts w:eastAsia="Times New Roman" w:cs="Arial" w:ascii="Arial" w:hAnsi="Arial"/>
+          <w:kern w:val="0"/>
+          <w:sz w:val="24"/>
+          <w:szCs w:val="24"/>
+          <w:lang w:eastAsia="es-CO"/>
+          <w14:ligatures w14:val="none"/>
+        </w:rPr>
+        <w:drawing>
+          <wp:anchor distT="0" distB="0" distL="0" distR="0" simplePos="0" relativeHeight="3" behindDoc="0" locked="0" layoutInCell="0" allowOverlap="1">
+            <wp:simplePos x="0" y="0"/>
+            <wp:positionH relativeFrom="column">
+              <wp:align>center</wp:align>
+            </wp:positionH>
+            <wp:positionV relativeFrom="paragraph">
+              <wp:posOffset>635</wp:posOffset>
+            </wp:positionV>
+            <wp:extent cx="5612130" cy="3131185"/>
+            <wp:effectExtent l="0" t="0" r="0" b="0"/>
+            <wp:wrapSquare wrapText="largest"/>
+            <wp:docPr id="2" name="Image2"/>
+            <wp:cNvGraphicFramePr>
+              <a:graphicFrameLocks xmlns:a="http://schemas.openxmlformats.org/drawingml/2006/main" noChangeAspect="1"/>
+            </wp:cNvGraphicFramePr>
+            <a:graphic xmlns:a="http://schemas.openxmlformats.org/drawingml/2006/main">
+              <a:graphicData uri="http://schemas.openxmlformats.org/drawingml/2006/picture">
+                <pic:pic xmlns:pic="http://schemas.openxmlformats.org/drawingml/2006/picture">
+                  <pic:nvPicPr>
+                    <pic:cNvPr id="2" name="Image2"/>
+                    <pic:cNvPicPr>
+                      <a:picLocks noChangeAspect="1" noChangeArrowheads="1"/>
+                    </pic:cNvPicPr>
+                  </pic:nvPicPr>
+                  <pic:blipFill>
+                    <a:blip r:embed="rId3"/>
+                    <a:stretch>
+                      <a:fillRect/>
+                    </a:stretch>
+                  </pic:blipFill>
+                  <pic:spPr bwMode="auto">
+                    <a:xfrm>
+                      <a:off x="0" y="0"/>
+                      <a:ext cx="5612130" cy="3131185"/>
+                    </a:xfrm>
+                    <a:prstGeom prst="rect">
+                      <a:avLst/>
+                    </a:prstGeom>
+                    <a:noFill/>
+                  </pic:spPr>
+                </pic:pic>
+              </a:graphicData>
+            </a:graphic>
+          </wp:anchor>
+        </w:drawing>
+      </w:r>
     </w:p>
     <w:sectPr>
+      <w:type w:val="nextPage"/>
       <w:pgSz w:w="12240" w:h="15840"/>
-      <w:pgMar w:top="1417" w:right="1701" w:bottom="1417" w:left="1701" w:header="708" w:footer="708" w:gutter="0"/>
-      <w:cols w:space="708"/>
-      <w:docGrid w:linePitch="360"/>
+      <w:pgMar w:left="1701" w:right="1701" w:gutter="0" w:header="0" w:top="1417" w:footer="0" w:bottom="1417"/>
+      <w:pgNumType w:fmt="decimal"/>
+      <w:formProt w:val="false"/>
+      <w:textDirection w:val="lrTb"/>
+      <w:docGrid w:type="default" w:linePitch="360" w:charSpace="0"/>
     </w:sectPr>
   </w:body>
 </w:document>
 </file>
 
 <file path=word/numbering.xml><?xml version="1.0" encoding="utf-8"?>
-<w:numbering xmlns:wpc="http://schemas.microsoft.com/office/word/2010/wordprocessingCanvas" xmlns:cx="http://schemas.microsoft.com/office/drawing/2014/chartex" xmlns:cx1="http://schemas.microsoft.com/office/drawing/2015/9/8/chartex" xmlns:cx2="http://schemas.microsoft.com/office/drawing/2015/10/21/chartex" xmlns:cx3="http://schemas.microsoft.com/office/drawing/2016/5/9/chartex" xmlns:cx4="http://schemas.microsoft.com/office/drawing/2016/5/10/chartex" xmlns:cx5="http://schemas.microsoft.com/office/drawing/2016/5/11/chartex" xmlns:cx6="http://schemas.microsoft.com/office/drawing/2016/5/12/chartex" xmlns:cx7="http://schemas.microsoft.com/office/drawing/2016/5/13/chartex" xmlns:cx8="http://schemas.microsoft.com/office/drawing/2016/5/14/chartex" xmlns:mc="http://schemas.openxmlformats.org/markup-compatibility/2006" xmlns:aink="http://schemas.microsoft.com/office/drawing/2016/ink" xmlns:am3d="http://schemas.microsoft.com/office/drawing/2017/model3d" xmlns:o="urn:schemas-microsoft-com:office:office" xmlns:oel="http://schemas.microsoft.com/office/2019/extlst" xmlns:r="http://schemas.openxmlformats.org/officeDocument/2006/relationships" xmlns:m="http://schemas.openxmlformats.org/officeDocument/2006/math" xmlns:v="urn:schemas-microsoft-com:vml" xmlns:wp14="http://schemas.microsoft.com/office/word/2010/wordprocessingDrawing" xmlns:wp="http://schemas.openxmlformats.org/drawingml/2006/wordprocessingDrawing" xmlns:w10="urn:schemas-microsoft-com:office:word" xmlns:w="http://schemas.openxmlformats.org/wordprocessingml/2006/main" xmlns:w14="http://schemas.microsoft.com/office/word/2010/wordml" xmlns:w15="http://schemas.microsoft.com/office/word/2012/wordml" xmlns:w16cex="http://schemas.microsoft.com/office/word/2018/wordml/cex" xmlns:w16cid="http://schemas.microsoft.com/office/word/2016/wordml/cid" xmlns:w16="http://schemas.microsoft.com/office/word/2018/wordml" xmlns:w16du="http://schemas.microsoft.com/office/word/2023/wordml/word16du" xmlns:w16sdtdh="http://schemas.microsoft.com/office/word/2020/wordml/sdtdatahash" xmlns:w16se="http://schemas.microsoft.com/office/word/2015/wordml/symex" xmlns:wpg="http://schemas.microsoft.com/office/word/2010/wordprocessingGroup" xmlns:wpi="http://schemas.microsoft.com/office/word/2010/wordprocessingInk" xmlns:wne="http://schemas.microsoft.com/office/word/2006/wordml" xmlns:wps="http://schemas.microsoft.com/office/word/2010/wordprocessingShape" mc:Ignorable="w14 w15 w16se w16cid w16 w16cex w16sdtdh w16du wp14">
-  <w:abstractNum w:abstractNumId="0" w15:restartNumberingAfterBreak="0">
-    <w:nsid w:val="0DBD4882"/>
-    <w:multiLevelType w:val="multilevel"/>
-    <w:tmpl w:val="E6E43E46"/>
+<w:numbering xmlns:w="http://schemas.openxmlformats.org/wordprocessingml/2006/main" xmlns:o="urn:schemas-microsoft-com:office:office" xmlns:r="http://schemas.openxmlformats.org/officeDocument/2006/relationships" xmlns:v="urn:schemas-microsoft-com:vml" xmlns:mc="http://schemas.openxmlformats.org/markup-compatibility/2006" xmlns:w14="http://schemas.microsoft.com/office/word/2010/wordml" mc:Ignorable="w14">
+  <w:abstractNum w:abstractNumId="1">
     <w:lvl w:ilvl="0">
       <w:start w:val="1"/>
       <w:numFmt w:val="bullet"/>
       <w:lvlText w:val=""/>
-      <w:lvlJc w:val="left"/>
+      <w:lvlJc w:val="start"/>
       <w:pPr>
         <w:tabs>
           <w:tab w:val="num" w:pos="720"/>
         </w:tabs>
-        <w:ind w:left="720" w:hanging="360"/>
+        <w:ind w:start="720" w:hanging="360"/>
       </w:pPr>
       <w:rPr>
-        <w:rFonts w:ascii="Symbol" w:hAnsi="Symbol" w:hint="default"/>
+        <w:rFonts w:ascii="Symbol" w:hAnsi="Symbol" w:cs="Symbol" w:hint="default"/>
         <w:sz w:val="20"/>
       </w:rPr>
     </w:lvl>
-    <w:lvl w:ilvl="1" w:tentative="1">
+    <w:lvl w:ilvl="1">
       <w:start w:val="1"/>
       <w:numFmt w:val="bullet"/>
       <w:lvlText w:val="o"/>
-      <w:lvlJc w:val="left"/>
+      <w:lvlJc w:val="start"/>
       <w:pPr>
         <w:tabs>
           <w:tab w:val="num" w:pos="1440"/>
         </w:tabs>
-        <w:ind w:left="1440" w:hanging="360"/>
+        <w:ind w:start="1440" w:hanging="360"/>
       </w:pPr>
       <w:rPr>
-        <w:rFonts w:ascii="Courier New" w:hAnsi="Courier New" w:hint="default"/>
+        <w:rFonts w:ascii="Courier New" w:hAnsi="Courier New" w:cs="Courier New" w:hint="default"/>
         <w:sz w:val="20"/>
       </w:rPr>
     </w:lvl>
-    <w:lvl w:ilvl="2" w:tentative="1">
+    <w:lvl w:ilvl="2">
       <w:start w:val="1"/>
       <w:numFmt w:val="bullet"/>
       <w:lvlText w:val=""/>
-      <w:lvlJc w:val="left"/>
+      <w:lvlJc w:val="start"/>
       <w:pPr>
         <w:tabs>
           <w:tab w:val="num" w:pos="2160"/>
         </w:tabs>
-        <w:ind w:left="2160" w:hanging="360"/>
+        <w:ind w:start="2160" w:hanging="360"/>
       </w:pPr>
       <w:rPr>
-        <w:rFonts w:ascii="Wingdings" w:hAnsi="Wingdings" w:hint="default"/>
+        <w:rFonts w:ascii="Wingdings" w:hAnsi="Wingdings" w:cs="Wingdings" w:hint="default"/>
         <w:sz w:val="20"/>
       </w:rPr>
     </w:lvl>
-    <w:lvl w:ilvl="3" w:tentative="1">
+    <w:lvl w:ilvl="3">
       <w:start w:val="1"/>
       <w:numFmt w:val="bullet"/>
       <w:lvlText w:val=""/>
-      <w:lvlJc w:val="left"/>
+      <w:lvlJc w:val="start"/>
       <w:pPr>
         <w:tabs>
           <w:tab w:val="num" w:pos="2880"/>
         </w:tabs>
-        <w:ind w:left="2880" w:hanging="360"/>
+        <w:ind w:start="2880" w:hanging="360"/>
       </w:pPr>
       <w:rPr>
-        <w:rFonts w:ascii="Wingdings" w:hAnsi="Wingdings" w:hint="default"/>
+        <w:rFonts w:ascii="Wingdings" w:hAnsi="Wingdings" w:cs="Wingdings" w:hint="default"/>
         <w:sz w:val="20"/>
       </w:rPr>
     </w:lvl>
-    <w:lvl w:ilvl="4" w:tentative="1">
+    <w:lvl w:ilvl="4">
       <w:start w:val="1"/>
       <w:numFmt w:val="bullet"/>
       <w:lvlText w:val=""/>
-      <w:lvlJc w:val="left"/>
+      <w:lvlJc w:val="start"/>
       <w:pPr>
         <w:tabs>
           <w:tab w:val="num" w:pos="3600"/>
         </w:tabs>
-        <w:ind w:left="3600" w:hanging="360"/>
+        <w:ind w:start="3600" w:hanging="360"/>
       </w:pPr>
       <w:rPr>
-        <w:rFonts w:ascii="Wingdings" w:hAnsi="Wingdings" w:hint="default"/>
+        <w:rFonts w:ascii="Wingdings" w:hAnsi="Wingdings" w:cs="Wingdings" w:hint="default"/>
         <w:sz w:val="20"/>
       </w:rPr>
     </w:lvl>
-    <w:lvl w:ilvl="5" w:tentative="1">
+    <w:lvl w:ilvl="5">
       <w:start w:val="1"/>
       <w:numFmt w:val="bullet"/>
       <w:lvlText w:val=""/>
-      <w:lvlJc w:val="left"/>
+      <w:lvlJc w:val="start"/>
       <w:pPr>
         <w:tabs>
           <w:tab w:val="num" w:pos="4320"/>
         </w:tabs>
-        <w:ind w:left="4320" w:hanging="360"/>
+        <w:ind w:start="4320" w:hanging="360"/>
       </w:pPr>
       <w:rPr>
-        <w:rFonts w:ascii="Wingdings" w:hAnsi="Wingdings" w:hint="default"/>
+        <w:rFonts w:ascii="Wingdings" w:hAnsi="Wingdings" w:cs="Wingdings" w:hint="default"/>
         <w:sz w:val="20"/>
       </w:rPr>
     </w:lvl>
-    <w:lvl w:ilvl="6" w:tentative="1">
+    <w:lvl w:ilvl="6">
       <w:start w:val="1"/>
       <w:numFmt w:val="bullet"/>
       <w:lvlText w:val=""/>
-      <w:lvlJc w:val="left"/>
+      <w:lvlJc w:val="start"/>
       <w:pPr>
         <w:tabs>
           <w:tab w:val="num" w:pos="5040"/>
         </w:tabs>
-        <w:ind w:left="5040" w:hanging="360"/>
+        <w:ind w:start="5040" w:hanging="360"/>
       </w:pPr>
       <w:rPr>
-        <w:rFonts w:ascii="Wingdings" w:hAnsi="Wingdings" w:hint="default"/>
+        <w:rFonts w:ascii="Wingdings" w:hAnsi="Wingdings" w:cs="Wingdings" w:hint="default"/>
         <w:sz w:val="20"/>
       </w:rPr>
     </w:lvl>
-    <w:lvl w:ilvl="7" w:tentative="1">
+    <w:lvl w:ilvl="7">
       <w:start w:val="1"/>
       <w:numFmt w:val="bullet"/>
       <w:lvlText w:val=""/>
-      <w:lvlJc w:val="left"/>
+      <w:lvlJc w:val="start"/>
       <w:pPr>
         <w:tabs>
           <w:tab w:val="num" w:pos="5760"/>
         </w:tabs>
-        <w:ind w:left="5760" w:hanging="360"/>
+        <w:ind w:start="5760" w:hanging="360"/>
       </w:pPr>
       <w:rPr>
-        <w:rFonts w:ascii="Wingdings" w:hAnsi="Wingdings" w:hint="default"/>
+        <w:rFonts w:ascii="Wingdings" w:hAnsi="Wingdings" w:cs="Wingdings" w:hint="default"/>
         <w:sz w:val="20"/>
       </w:rPr>
     </w:lvl>
-    <w:lvl w:ilvl="8" w:tentative="1">
+    <w:lvl w:ilvl="8">
       <w:start w:val="1"/>
       <w:numFmt w:val="bullet"/>
       <w:lvlText w:val=""/>
-      <w:lvlJc w:val="left"/>
+      <w:lvlJc w:val="start"/>
       <w:pPr>
         <w:tabs>
           <w:tab w:val="num" w:pos="6480"/>
         </w:tabs>
-        <w:ind w:left="6480" w:hanging="360"/>
+        <w:ind w:start="6480" w:hanging="360"/>
       </w:pPr>
       <w:rPr>
-        <w:rFonts w:ascii="Wingdings" w:hAnsi="Wingdings" w:hint="default"/>
+        <w:rFonts w:ascii="Wingdings" w:hAnsi="Wingdings" w:cs="Wingdings" w:hint="default"/>
         <w:sz w:val="20"/>
       </w:rPr>
     </w:lvl>
   </w:abstractNum>
-  <w:abstractNum w:abstractNumId="1" w15:restartNumberingAfterBreak="0">
-    <w:nsid w:val="15D11C7D"/>
-    <w:multiLevelType w:val="multilevel"/>
-    <w:tmpl w:val="2D988FE0"/>
+  <w:abstractNum w:abstractNumId="2">
     <w:lvl w:ilvl="0">
       <w:start w:val="1"/>
       <w:numFmt w:val="bullet"/>
       <w:lvlText w:val=""/>
-      <w:lvlJc w:val="left"/>
+      <w:lvlJc w:val="start"/>
       <w:pPr>
         <w:tabs>
           <w:tab w:val="num" w:pos="720"/>
         </w:tabs>
-        <w:ind w:left="720" w:hanging="360"/>
+        <w:ind w:start="720" w:hanging="360"/>
       </w:pPr>
       <w:rPr>
-        <w:rFonts w:ascii="Symbol" w:hAnsi="Symbol" w:hint="default"/>
+        <w:rFonts w:ascii="Symbol" w:hAnsi="Symbol" w:cs="Symbol" w:hint="default"/>
         <w:sz w:val="20"/>
       </w:rPr>
     </w:lvl>
-    <w:lvl w:ilvl="1" w:tentative="1">
+    <w:lvl w:ilvl="1">
       <w:start w:val="1"/>
       <w:numFmt w:val="bullet"/>
       <w:lvlText w:val="o"/>
-      <w:lvlJc w:val="left"/>
+      <w:lvlJc w:val="start"/>
       <w:pPr>
         <w:tabs>
           <w:tab w:val="num" w:pos="1440"/>
         </w:tabs>
-        <w:ind w:left="1440" w:hanging="360"/>
+        <w:ind w:start="1440" w:hanging="360"/>
       </w:pPr>
       <w:rPr>
-        <w:rFonts w:ascii="Courier New" w:hAnsi="Courier New" w:hint="default"/>
+        <w:rFonts w:ascii="Courier New" w:hAnsi="Courier New" w:cs="Courier New" w:hint="default"/>
         <w:sz w:val="20"/>
       </w:rPr>
     </w:lvl>
-    <w:lvl w:ilvl="2" w:tentative="1">
+    <w:lvl w:ilvl="2">
       <w:start w:val="1"/>
       <w:numFmt w:val="bullet"/>
       <w:lvlText w:val=""/>
-      <w:lvlJc w:val="left"/>
+      <w:lvlJc w:val="start"/>
       <w:pPr>
         <w:tabs>
           <w:tab w:val="num" w:pos="2160"/>
         </w:tabs>
-        <w:ind w:left="2160" w:hanging="360"/>
+        <w:ind w:start="2160" w:hanging="360"/>
       </w:pPr>
       <w:rPr>
-        <w:rFonts w:ascii="Wingdings" w:hAnsi="Wingdings" w:hint="default"/>
+        <w:rFonts w:ascii="Wingdings" w:hAnsi="Wingdings" w:cs="Wingdings" w:hint="default"/>
         <w:sz w:val="20"/>
       </w:rPr>
     </w:lvl>
-    <w:lvl w:ilvl="3" w:tentative="1">
+    <w:lvl w:ilvl="3">
       <w:start w:val="1"/>
       <w:numFmt w:val="bullet"/>
       <w:lvlText w:val=""/>
-      <w:lvlJc w:val="left"/>
+      <w:lvlJc w:val="start"/>
       <w:pPr>
         <w:tabs>
           <w:tab w:val="num" w:pos="2880"/>
         </w:tabs>
-        <w:ind w:left="2880" w:hanging="360"/>
+        <w:ind w:start="2880" w:hanging="360"/>
       </w:pPr>
       <w:rPr>
-        <w:rFonts w:ascii="Wingdings" w:hAnsi="Wingdings" w:hint="default"/>
+        <w:rFonts w:ascii="Wingdings" w:hAnsi="Wingdings" w:cs="Wingdings" w:hint="default"/>
         <w:sz w:val="20"/>
       </w:rPr>
     </w:lvl>
-    <w:lvl w:ilvl="4" w:tentative="1">
+    <w:lvl w:ilvl="4">
       <w:start w:val="1"/>
       <w:numFmt w:val="bullet"/>
       <w:lvlText w:val=""/>
-      <w:lvlJc w:val="left"/>
+      <w:lvlJc w:val="start"/>
       <w:pPr>
         <w:tabs>
           <w:tab w:val="num" w:pos="3600"/>
         </w:tabs>
-        <w:ind w:left="3600" w:hanging="360"/>
+        <w:ind w:start="3600" w:hanging="360"/>
       </w:pPr>
       <w:rPr>
-        <w:rFonts w:ascii="Wingdings" w:hAnsi="Wingdings" w:hint="default"/>
+        <w:rFonts w:ascii="Wingdings" w:hAnsi="Wingdings" w:cs="Wingdings" w:hint="default"/>
         <w:sz w:val="20"/>
       </w:rPr>
     </w:lvl>
-    <w:lvl w:ilvl="5" w:tentative="1">
+    <w:lvl w:ilvl="5">
       <w:start w:val="1"/>
       <w:numFmt w:val="bullet"/>
       <w:lvlText w:val=""/>
-      <w:lvlJc w:val="left"/>
+      <w:lvlJc w:val="start"/>
       <w:pPr>
         <w:tabs>
           <w:tab w:val="num" w:pos="4320"/>
         </w:tabs>
-        <w:ind w:left="4320" w:hanging="360"/>
+        <w:ind w:start="4320" w:hanging="360"/>
       </w:pPr>
       <w:rPr>
-        <w:rFonts w:ascii="Wingdings" w:hAnsi="Wingdings" w:hint="default"/>
+        <w:rFonts w:ascii="Wingdings" w:hAnsi="Wingdings" w:cs="Wingdings" w:hint="default"/>
         <w:sz w:val="20"/>
       </w:rPr>
     </w:lvl>
-    <w:lvl w:ilvl="6" w:tentative="1">
+    <w:lvl w:ilvl="6">
       <w:start w:val="1"/>
       <w:numFmt w:val="bullet"/>
       <w:lvlText w:val=""/>
-      <w:lvlJc w:val="left"/>
+      <w:lvlJc w:val="start"/>
       <w:pPr>
         <w:tabs>
           <w:tab w:val="num" w:pos="5040"/>
         </w:tabs>
-        <w:ind w:left="5040" w:hanging="360"/>
+        <w:ind w:start="5040" w:hanging="360"/>
       </w:pPr>
       <w:rPr>
-        <w:rFonts w:ascii="Wingdings" w:hAnsi="Wingdings" w:hint="default"/>
+        <w:rFonts w:ascii="Wingdings" w:hAnsi="Wingdings" w:cs="Wingdings" w:hint="default"/>
         <w:sz w:val="20"/>
       </w:rPr>
     </w:lvl>
-    <w:lvl w:ilvl="7" w:tentative="1">
+    <w:lvl w:ilvl="7">
       <w:start w:val="1"/>
       <w:numFmt w:val="bullet"/>
       <w:lvlText w:val=""/>
-      <w:lvlJc w:val="left"/>
+      <w:lvlJc w:val="start"/>
       <w:pPr>
         <w:tabs>
           <w:tab w:val="num" w:pos="5760"/>
         </w:tabs>
-        <w:ind w:left="5760" w:hanging="360"/>
+        <w:ind w:start="5760" w:hanging="360"/>
       </w:pPr>
       <w:rPr>
-        <w:rFonts w:ascii="Wingdings" w:hAnsi="Wingdings" w:hint="default"/>
+        <w:rFonts w:ascii="Wingdings" w:hAnsi="Wingdings" w:cs="Wingdings" w:hint="default"/>
         <w:sz w:val="20"/>
       </w:rPr>
     </w:lvl>
-    <w:lvl w:ilvl="8" w:tentative="1">
+    <w:lvl w:ilvl="8">
       <w:start w:val="1"/>
       <w:numFmt w:val="bullet"/>
       <w:lvlText w:val=""/>
-      <w:lvlJc w:val="left"/>
+      <w:lvlJc w:val="start"/>
       <w:pPr>
         <w:tabs>
           <w:tab w:val="num" w:pos="6480"/>
         </w:tabs>
-        <w:ind w:left="6480" w:hanging="360"/>
+        <w:ind w:start="6480" w:hanging="360"/>
       </w:pPr>
       <w:rPr>
-        <w:rFonts w:ascii="Wingdings" w:hAnsi="Wingdings" w:hint="default"/>
+        <w:rFonts w:ascii="Wingdings" w:hAnsi="Wingdings" w:cs="Wingdings" w:hint="default"/>
         <w:sz w:val="20"/>
       </w:rPr>
     </w:lvl>
   </w:abstractNum>
-  <w:abstractNum w:abstractNumId="2" w15:restartNumberingAfterBreak="0">
-    <w:nsid w:val="6F027413"/>
-    <w:multiLevelType w:val="multilevel"/>
-    <w:tmpl w:val="771005F4"/>
+  <w:abstractNum w:abstractNumId="3">
     <w:lvl w:ilvl="0">
       <w:start w:val="1"/>
       <w:numFmt w:val="bullet"/>
       <w:lvlText w:val=""/>
-      <w:lvlJc w:val="left"/>
+      <w:lvlJc w:val="start"/>
       <w:pPr>
         <w:tabs>
           <w:tab w:val="num" w:pos="720"/>
         </w:tabs>
-        <w:ind w:left="720" w:hanging="360"/>
+        <w:ind w:start="720" w:hanging="360"/>
       </w:pPr>
       <w:rPr>
-        <w:rFonts w:ascii="Symbol" w:hAnsi="Symbol" w:hint="default"/>
+        <w:rFonts w:ascii="Symbol" w:hAnsi="Symbol" w:cs="Symbol" w:hint="default"/>
         <w:sz w:val="20"/>
       </w:rPr>
     </w:lvl>
-    <w:lvl w:ilvl="1" w:tentative="1">
+    <w:lvl w:ilvl="1">
       <w:start w:val="1"/>
       <w:numFmt w:val="bullet"/>
       <w:lvlText w:val="o"/>
-      <w:lvlJc w:val="left"/>
+      <w:lvlJc w:val="start"/>
       <w:pPr>
         <w:tabs>
           <w:tab w:val="num" w:pos="1440"/>
         </w:tabs>
-        <w:ind w:left="1440" w:hanging="360"/>
+        <w:ind w:start="1440" w:hanging="360"/>
       </w:pPr>
       <w:rPr>
-        <w:rFonts w:ascii="Courier New" w:hAnsi="Courier New" w:hint="default"/>
+        <w:rFonts w:ascii="Courier New" w:hAnsi="Courier New" w:cs="Courier New" w:hint="default"/>
         <w:sz w:val="20"/>
       </w:rPr>
     </w:lvl>
-    <w:lvl w:ilvl="2" w:tentative="1">
+    <w:lvl w:ilvl="2">
       <w:start w:val="1"/>
       <w:numFmt w:val="bullet"/>
       <w:lvlText w:val=""/>
-      <w:lvlJc w:val="left"/>
+      <w:lvlJc w:val="start"/>
       <w:pPr>
         <w:tabs>
           <w:tab w:val="num" w:pos="2160"/>
         </w:tabs>
-        <w:ind w:left="2160" w:hanging="360"/>
+        <w:ind w:start="2160" w:hanging="360"/>
       </w:pPr>
       <w:rPr>
-        <w:rFonts w:ascii="Wingdings" w:hAnsi="Wingdings" w:hint="default"/>
+        <w:rFonts w:ascii="Wingdings" w:hAnsi="Wingdings" w:cs="Wingdings" w:hint="default"/>
         <w:sz w:val="20"/>
       </w:rPr>
     </w:lvl>
-    <w:lvl w:ilvl="3" w:tentative="1">
+    <w:lvl w:ilvl="3">
       <w:start w:val="1"/>
       <w:numFmt w:val="bullet"/>
       <w:lvlText w:val=""/>
-      <w:lvlJc w:val="left"/>
+      <w:lvlJc w:val="start"/>
       <w:pPr>
         <w:tabs>
           <w:tab w:val="num" w:pos="2880"/>
         </w:tabs>
-        <w:ind w:left="2880" w:hanging="360"/>
+        <w:ind w:start="2880" w:hanging="360"/>
       </w:pPr>
       <w:rPr>
-        <w:rFonts w:ascii="Wingdings" w:hAnsi="Wingdings" w:hint="default"/>
+        <w:rFonts w:ascii="Wingdings" w:hAnsi="Wingdings" w:cs="Wingdings" w:hint="default"/>
         <w:sz w:val="20"/>
       </w:rPr>
     </w:lvl>
-    <w:lvl w:ilvl="4" w:tentative="1">
+    <w:lvl w:ilvl="4">
       <w:start w:val="1"/>
       <w:numFmt w:val="bullet"/>
       <w:lvlText w:val=""/>
-      <w:lvlJc w:val="left"/>
+      <w:lvlJc w:val="start"/>
       <w:pPr>
         <w:tabs>
           <w:tab w:val="num" w:pos="3600"/>
         </w:tabs>
-        <w:ind w:left="3600" w:hanging="360"/>
+        <w:ind w:start="3600" w:hanging="360"/>
       </w:pPr>
       <w:rPr>
-        <w:rFonts w:ascii="Wingdings" w:hAnsi="Wingdings" w:hint="default"/>
+        <w:rFonts w:ascii="Wingdings" w:hAnsi="Wingdings" w:cs="Wingdings" w:hint="default"/>
         <w:sz w:val="20"/>
       </w:rPr>
     </w:lvl>
-    <w:lvl w:ilvl="5" w:tentative="1">
+    <w:lvl w:ilvl="5">
       <w:start w:val="1"/>
       <w:numFmt w:val="bullet"/>
       <w:lvlText w:val=""/>
-      <w:lvlJc w:val="left"/>
+      <w:lvlJc w:val="start"/>
       <w:pPr>
         <w:tabs>
           <w:tab w:val="num" w:pos="4320"/>
         </w:tabs>
-        <w:ind w:left="4320" w:hanging="360"/>
+        <w:ind w:start="4320" w:hanging="360"/>
       </w:pPr>
       <w:rPr>
-        <w:rFonts w:ascii="Wingdings" w:hAnsi="Wingdings" w:hint="default"/>
+        <w:rFonts w:ascii="Wingdings" w:hAnsi="Wingdings" w:cs="Wingdings" w:hint="default"/>
         <w:sz w:val="20"/>
       </w:rPr>
     </w:lvl>
-    <w:lvl w:ilvl="6" w:tentative="1">
+    <w:lvl w:ilvl="6">
       <w:start w:val="1"/>
       <w:numFmt w:val="bullet"/>
       <w:lvlText w:val=""/>
-      <w:lvlJc w:val="left"/>
+      <w:lvlJc w:val="start"/>
       <w:pPr>
         <w:tabs>
           <w:tab w:val="num" w:pos="5040"/>
         </w:tabs>
-        <w:ind w:left="5040" w:hanging="360"/>
+        <w:ind w:start="5040" w:hanging="360"/>
       </w:pPr>
       <w:rPr>
-        <w:rFonts w:ascii="Wingdings" w:hAnsi="Wingdings" w:hint="default"/>
+        <w:rFonts w:ascii="Wingdings" w:hAnsi="Wingdings" w:cs="Wingdings" w:hint="default"/>
         <w:sz w:val="20"/>
       </w:rPr>
     </w:lvl>
-    <w:lvl w:ilvl="7" w:tentative="1">
+    <w:lvl w:ilvl="7">
       <w:start w:val="1"/>
       <w:numFmt w:val="bullet"/>
       <w:lvlText w:val=""/>
-      <w:lvlJc w:val="left"/>
+      <w:lvlJc w:val="start"/>
       <w:pPr>
         <w:tabs>
           <w:tab w:val="num" w:pos="5760"/>
         </w:tabs>
-        <w:ind w:left="5760" w:hanging="360"/>
+        <w:ind w:start="5760" w:hanging="360"/>
       </w:pPr>
       <w:rPr>
-        <w:rFonts w:ascii="Wingdings" w:hAnsi="Wingdings" w:hint="default"/>
+        <w:rFonts w:ascii="Wingdings" w:hAnsi="Wingdings" w:cs="Wingdings" w:hint="default"/>
         <w:sz w:val="20"/>
       </w:rPr>
     </w:lvl>
-    <w:lvl w:ilvl="8" w:tentative="1">
+    <w:lvl w:ilvl="8">
       <w:start w:val="1"/>
       <w:numFmt w:val="bullet"/>
       <w:lvlText w:val=""/>
-      <w:lvlJc w:val="left"/>
+      <w:lvlJc w:val="start"/>
       <w:pPr>
         <w:tabs>
           <w:tab w:val="num" w:pos="6480"/>
         </w:tabs>
-        <w:ind w:left="6480" w:hanging="360"/>
+        <w:ind w:start="6480" w:hanging="360"/>
       </w:pPr>
       <w:rPr>
-        <w:rFonts w:ascii="Wingdings" w:hAnsi="Wingdings" w:hint="default"/>
+        <w:rFonts w:ascii="Wingdings" w:hAnsi="Wingdings" w:cs="Wingdings" w:hint="default"/>
         <w:sz w:val="20"/>
       </w:rPr>
     </w:lvl>
   </w:abstractNum>
-  <w:num w:numId="1" w16cid:durableId="1000276583">
+  <w:abstractNum w:abstractNumId="4">
+    <w:lvl w:ilvl="0">
+      <w:start w:val="1"/>
+      <w:numFmt w:val="none"/>
+      <w:suff w:val="nothing"/>
+      <w:lvlText w:val=""/>
+      <w:lvlJc w:val="start"/>
+      <w:pPr>
+        <w:tabs>
+          <w:tab w:val="num" w:pos="0"/>
+        </w:tabs>
+        <w:ind w:start="0" w:hanging="0"/>
+      </w:pPr>
+    </w:lvl>
+    <w:lvl w:ilvl="1">
+      <w:start w:val="1"/>
+      <w:numFmt w:val="none"/>
+      <w:suff w:val="nothing"/>
+      <w:lvlText w:val=""/>
+      <w:lvlJc w:val="start"/>
+      <w:pPr>
+        <w:tabs>
+          <w:tab w:val="num" w:pos="0"/>
+        </w:tabs>
+        <w:ind w:start="0" w:hanging="0"/>
+      </w:pPr>
+    </w:lvl>
+    <w:lvl w:ilvl="2">
+      <w:start w:val="1"/>
+      <w:numFmt w:val="none"/>
+      <w:suff w:val="nothing"/>
+      <w:lvlText w:val=""/>
+      <w:lvlJc w:val="start"/>
+      <w:pPr>
+        <w:tabs>
+          <w:tab w:val="num" w:pos="0"/>
+        </w:tabs>
+        <w:ind w:start="0" w:hanging="0"/>
+      </w:pPr>
+    </w:lvl>
+    <w:lvl w:ilvl="3">
+      <w:start w:val="1"/>
+      <w:numFmt w:val="none"/>
+      <w:suff w:val="nothing"/>
+      <w:lvlText w:val=""/>
+      <w:lvlJc w:val="start"/>
+      <w:pPr>
+        <w:tabs>
+          <w:tab w:val="num" w:pos="0"/>
+        </w:tabs>
+        <w:ind w:start="0" w:hanging="0"/>
+      </w:pPr>
+    </w:lvl>
+    <w:lvl w:ilvl="4">
+      <w:start w:val="1"/>
+      <w:numFmt w:val="none"/>
+      <w:suff w:val="nothing"/>
+      <w:lvlText w:val=""/>
+      <w:lvlJc w:val="start"/>
+      <w:pPr>
+        <w:tabs>
+          <w:tab w:val="num" w:pos="0"/>
+        </w:tabs>
+        <w:ind w:start="0" w:hanging="0"/>
+      </w:pPr>
+    </w:lvl>
+    <w:lvl w:ilvl="5">
+      <w:start w:val="1"/>
+      <w:numFmt w:val="none"/>
+      <w:suff w:val="nothing"/>
+      <w:lvlText w:val=""/>
+      <w:lvlJc w:val="start"/>
+      <w:pPr>
+        <w:tabs>
+          <w:tab w:val="num" w:pos="0"/>
+        </w:tabs>
+        <w:ind w:start="0" w:hanging="0"/>
+      </w:pPr>
+    </w:lvl>
+    <w:lvl w:ilvl="6">
+      <w:start w:val="1"/>
+      <w:numFmt w:val="none"/>
+      <w:suff w:val="nothing"/>
+      <w:lvlText w:val=""/>
+      <w:lvlJc w:val="start"/>
+      <w:pPr>
+        <w:tabs>
+          <w:tab w:val="num" w:pos="0"/>
+        </w:tabs>
+        <w:ind w:start="0" w:hanging="0"/>
+      </w:pPr>
+    </w:lvl>
+    <w:lvl w:ilvl="7">
+      <w:start w:val="1"/>
+      <w:numFmt w:val="none"/>
+      <w:suff w:val="nothing"/>
+      <w:lvlText w:val=""/>
+      <w:lvlJc w:val="start"/>
+      <w:pPr>
+        <w:tabs>
+          <w:tab w:val="num" w:pos="0"/>
+        </w:tabs>
+        <w:ind w:start="0" w:hanging="0"/>
+      </w:pPr>
+    </w:lvl>
+    <w:lvl w:ilvl="8">
+      <w:start w:val="1"/>
+      <w:numFmt w:val="none"/>
+      <w:suff w:val="nothing"/>
+      <w:lvlText w:val=""/>
+      <w:lvlJc w:val="start"/>
+      <w:pPr>
+        <w:tabs>
+          <w:tab w:val="num" w:pos="0"/>
+        </w:tabs>
+        <w:ind w:start="0" w:hanging="0"/>
+      </w:pPr>
+    </w:lvl>
+  </w:abstractNum>
+  <w:num w:numId="1">
     <w:abstractNumId w:val="1"/>
   </w:num>
-  <w:num w:numId="2" w16cid:durableId="1476487225">
+  <w:num w:numId="2">
     <w:abstractNumId w:val="2"/>
   </w:num>
-  <w:num w:numId="3" w16cid:durableId="310797359">
-    <w:abstractNumId w:val="0"/>
+  <w:num w:numId="3">
+    <w:abstractNumId w:val="3"/>
+  </w:num>
+  <w:num w:numId="4">
+    <w:abstractNumId w:val="4"/>
   </w:num>
 </w:numbering>
 </file>
 
 <file path=word/styles.xml><?xml version="1.0" encoding="utf-8"?>
-<w:styles xmlns:mc="http://schemas.openxmlformats.org/markup-compatibility/2006" xmlns:r="http://schemas.openxmlformats.org/officeDocument/2006/relationships" xmlns:w="http://schemas.openxmlformats.org/wordprocessingml/2006/main" xmlns:w14="http://schemas.microsoft.com/office/word/2010/wordml" xmlns:w15="http://schemas.microsoft.com/office/word/2012/wordml" xmlns:w16cex="http://schemas.microsoft.com/office/word/2018/wordml/cex" xmlns:w16cid="http://schemas.microsoft.com/office/word/2016/wordml/cid" xmlns:w16="http://schemas.microsoft.com/office/word/2018/wordml" xmlns:w16du="http://schemas.microsoft.com/office/word/2023/wordml/word16du" xmlns:w16sdtdh="http://schemas.microsoft.com/office/word/2020/wordml/sdtdatahash" xmlns:w16se="http://schemas.microsoft.com/office/word/2015/wordml/symex" mc:Ignorable="w14 w15 w16se w16cid w16 w16cex w16sdtdh w16du">
+<w:styles xmlns:w="http://schemas.openxmlformats.org/wordprocessingml/2006/main" xmlns:w14="http://schemas.microsoft.com/office/word/2010/wordml" xmlns:mc="http://schemas.openxmlformats.org/markup-compatibility/2006" mc:Ignorable="w14">
   <w:docDefaults>
     <w:rPrDefault>
       <w:rPr>
-        <w:rFonts w:asciiTheme="minorHAnsi" w:eastAsiaTheme="minorHAnsi" w:hAnsiTheme="minorHAnsi" w:cstheme="minorBidi"/>
+        <w:rFonts w:ascii="Calibri" w:hAnsi="Calibri" w:eastAsia="Calibri" w:cs="" w:asciiTheme="minorHAnsi" w:cstheme="minorBidi" w:eastAsiaTheme="minorHAnsi" w:hAnsiTheme="minorHAnsi"/>
         <w:kern w:val="2"/>
         <w:sz w:val="22"/>
         <w:szCs w:val="22"/>
@@ -1744,21 +2363,21 @@
     </w:rPrDefault>
     <w:pPrDefault>
       <w:pPr>
-        <w:spacing w:after="160" w:line="259" w:lineRule="auto"/>
+        <w:suppressAutoHyphens w:val="true"/>
       </w:pPr>
     </w:pPrDefault>
   </w:docDefaults>
   <w:latentStyles w:defLockedState="0" w:defUIPriority="99" w:defSemiHidden="0" w:defUnhideWhenUsed="0" w:defQFormat="0" w:count="376">
     <w:lsdException w:name="Normal" w:uiPriority="0" w:qFormat="1"/>
     <w:lsdException w:name="heading 1" w:uiPriority="9" w:qFormat="1"/>
-    <w:lsdException w:name="heading 2" w:semiHidden="1" w:uiPriority="9" w:unhideWhenUsed="1" w:qFormat="1"/>
-    <w:lsdException w:name="heading 3" w:semiHidden="1" w:uiPriority="9" w:unhideWhenUsed="1" w:qFormat="1"/>
-    <w:lsdException w:name="heading 4" w:semiHidden="1" w:uiPriority="9" w:unhideWhenUsed="1" w:qFormat="1"/>
-    <w:lsdException w:name="heading 5" w:semiHidden="1" w:uiPriority="9" w:unhideWhenUsed="1" w:qFormat="1"/>
-    <w:lsdException w:name="heading 6" w:semiHidden="1" w:uiPriority="9" w:unhideWhenUsed="1" w:qFormat="1"/>
-    <w:lsdException w:name="heading 7" w:semiHidden="1" w:uiPriority="9" w:unhideWhenUsed="1" w:qFormat="1"/>
-    <w:lsdException w:name="heading 8" w:semiHidden="1" w:uiPriority="9" w:unhideWhenUsed="1" w:qFormat="1"/>
-    <w:lsdException w:name="heading 9" w:semiHidden="1" w:uiPriority="9" w:unhideWhenUsed="1" w:qFormat="1"/>
+    <w:lsdException w:name="heading 2" w:uiPriority="9" w:semiHidden="1" w:unhideWhenUsed="1" w:qFormat="1"/>
+    <w:lsdException w:name="heading 3" w:uiPriority="9" w:semiHidden="1" w:unhideWhenUsed="1" w:qFormat="1"/>
+    <w:lsdException w:name="heading 4" w:uiPriority="9" w:semiHidden="1" w:unhideWhenUsed="1" w:qFormat="1"/>
+    <w:lsdException w:name="heading 5" w:uiPriority="9" w:semiHidden="1" w:unhideWhenUsed="1" w:qFormat="1"/>
+    <w:lsdException w:name="heading 6" w:uiPriority="9" w:semiHidden="1" w:unhideWhenUsed="1" w:qFormat="1"/>
+    <w:lsdException w:name="heading 7" w:uiPriority="9" w:semiHidden="1" w:unhideWhenUsed="1" w:qFormat="1"/>
+    <w:lsdException w:name="heading 8" w:uiPriority="9" w:semiHidden="1" w:unhideWhenUsed="1" w:qFormat="1"/>
+    <w:lsdException w:name="heading 9" w:uiPriority="9" w:semiHidden="1" w:unhideWhenUsed="1" w:qFormat="1"/>
     <w:lsdException w:name="index 1" w:semiHidden="1" w:unhideWhenUsed="1"/>
     <w:lsdException w:name="index 2" w:semiHidden="1" w:unhideWhenUsed="1"/>
     <w:lsdException w:name="index 3" w:semiHidden="1" w:unhideWhenUsed="1"/>
@@ -1768,22 +2387,22 @@
     <w:lsdException w:name="index 7" w:semiHidden="1" w:unhideWhenUsed="1"/>
     <w:lsdException w:name="index 8" w:semiHidden="1" w:unhideWhenUsed="1"/>
     <w:lsdException w:name="index 9" w:semiHidden="1" w:unhideWhenUsed="1"/>
-    <w:lsdException w:name="toc 1" w:semiHidden="1" w:uiPriority="39" w:unhideWhenUsed="1"/>
-    <w:lsdException w:name="toc 2" w:semiHidden="1" w:uiPriority="39" w:unhideWhenUsed="1"/>
-    <w:lsdException w:name="toc 3" w:semiHidden="1" w:uiPriority="39" w:unhideWhenUsed="1"/>
-    <w:lsdException w:name="toc 4" w:semiHidden="1" w:uiPriority="39" w:unhideWhenUsed="1"/>
-    <w:lsdException w:name="toc 5" w:semiHidden="1" w:uiPriority="39" w:unhideWhenUsed="1"/>
-    <w:lsdException w:name="toc 6" w:semiHidden="1" w:uiPriority="39" w:unhideWhenUsed="1"/>
-    <w:lsdException w:name="toc 7" w:semiHidden="1" w:uiPriority="39" w:unhideWhenUsed="1"/>
-    <w:lsdException w:name="toc 8" w:semiHidden="1" w:uiPriority="39" w:unhideWhenUsed="1"/>
-    <w:lsdException w:name="toc 9" w:semiHidden="1" w:uiPriority="39" w:unhideWhenUsed="1"/>
+    <w:lsdException w:name="toc 1" w:uiPriority="39" w:semiHidden="1" w:unhideWhenUsed="1"/>
+    <w:lsdException w:name="toc 2" w:uiPriority="39" w:semiHidden="1" w:unhideWhenUsed="1"/>
+    <w:lsdException w:name="toc 3" w:uiPriority="39" w:semiHidden="1" w:unhideWhenUsed="1"/>
+    <w:lsdException w:name="toc 4" w:uiPriority="39" w:semiHidden="1" w:unhideWhenUsed="1"/>
+    <w:lsdException w:name="toc 5" w:uiPriority="39" w:semiHidden="1" w:unhideWhenUsed="1"/>
+    <w:lsdException w:name="toc 6" w:uiPriority="39" w:semiHidden="1" w:unhideWhenUsed="1"/>
+    <w:lsdException w:name="toc 7" w:uiPriority="39" w:semiHidden="1" w:unhideWhenUsed="1"/>
+    <w:lsdException w:name="toc 8" w:uiPriority="39" w:semiHidden="1" w:unhideWhenUsed="1"/>
+    <w:lsdException w:name="toc 9" w:uiPriority="39" w:semiHidden="1" w:unhideWhenUsed="1"/>
     <w:lsdException w:name="Normal Indent" w:semiHidden="1" w:unhideWhenUsed="1"/>
     <w:lsdException w:name="footnote text" w:semiHidden="1" w:unhideWhenUsed="1"/>
     <w:lsdException w:name="annotation text" w:semiHidden="1" w:unhideWhenUsed="1"/>
     <w:lsdException w:name="header" w:semiHidden="1" w:unhideWhenUsed="1"/>
     <w:lsdException w:name="footer" w:semiHidden="1" w:unhideWhenUsed="1"/>
     <w:lsdException w:name="index heading" w:semiHidden="1" w:unhideWhenUsed="1"/>
-    <w:lsdException w:name="caption" w:semiHidden="1" w:uiPriority="35" w:unhideWhenUsed="1" w:qFormat="1"/>
+    <w:lsdException w:name="caption" w:uiPriority="35" w:semiHidden="1" w:unhideWhenUsed="1" w:qFormat="1"/>
     <w:lsdException w:name="table of figures" w:semiHidden="1" w:unhideWhenUsed="1"/>
     <w:lsdException w:name="envelope address" w:semiHidden="1" w:unhideWhenUsed="1"/>
     <w:lsdException w:name="envelope return" w:semiHidden="1" w:unhideWhenUsed="1"/>
@@ -1814,7 +2433,7 @@
     <w:lsdException w:name="Title" w:uiPriority="10" w:qFormat="1"/>
     <w:lsdException w:name="Closing" w:semiHidden="1" w:unhideWhenUsed="1"/>
     <w:lsdException w:name="Signature" w:semiHidden="1" w:unhideWhenUsed="1"/>
-    <w:lsdException w:name="Default Paragraph Font" w:semiHidden="1" w:uiPriority="1" w:unhideWhenUsed="1"/>
+    <w:lsdException w:name="Default Paragraph Font" w:uiPriority="1" w:semiHidden="1" w:unhideWhenUsed="1"/>
     <w:lsdException w:name="Body Text" w:semiHidden="1" w:unhideWhenUsed="1"/>
     <w:lsdException w:name="Body Text Indent" w:semiHidden="1" w:unhideWhenUsed="1"/>
     <w:lsdException w:name="List Continue" w:semiHidden="1" w:unhideWhenUsed="1"/>
@@ -2014,8 +2633,8 @@
     <w:lsdException w:name="Subtle Reference" w:uiPriority="31" w:qFormat="1"/>
     <w:lsdException w:name="Intense Reference" w:uiPriority="32" w:qFormat="1"/>
     <w:lsdException w:name="Book Title" w:uiPriority="33" w:qFormat="1"/>
-    <w:lsdException w:name="Bibliography" w:semiHidden="1" w:uiPriority="37" w:unhideWhenUsed="1"/>
-    <w:lsdException w:name="TOC Heading" w:semiHidden="1" w:uiPriority="39" w:unhideWhenUsed="1" w:qFormat="1"/>
+    <w:lsdException w:name="Bibliography" w:uiPriority="37" w:semiHidden="1" w:unhideWhenUsed="1"/>
+    <w:lsdException w:name="TOC Heading" w:uiPriority="39" w:semiHidden="1" w:unhideWhenUsed="1" w:qFormat="1"/>
     <w:lsdException w:name="Plain Table 1" w:uiPriority="41"/>
     <w:lsdException w:name="Plain Table 2" w:uiPriority="42"/>
     <w:lsdException w:name="Plain Table 3" w:uiPriority="43"/>
@@ -2126,45 +2745,60 @@
     <w:lsdException w:name="Unresolved Mention" w:semiHidden="1" w:unhideWhenUsed="1"/>
     <w:lsdException w:name="Smart Link" w:semiHidden="1" w:unhideWhenUsed="1"/>
   </w:latentStyles>
-  <w:style w:type="paragraph" w:default="1" w:styleId="Normal">
+  <w:style w:type="paragraph" w:styleId="Normal" w:default="1">
     <w:name w:val="Normal"/>
     <w:qFormat/>
+    <w:pPr>
+      <w:widowControl/>
+      <w:bidi w:val="0"/>
+      <w:spacing w:lineRule="auto" w:line="259" w:before="0" w:after="160"/>
+      <w:jc w:val="start"/>
+    </w:pPr>
+    <w:rPr>
+      <w:rFonts w:ascii="Calibri" w:hAnsi="Calibri" w:eastAsia="Calibri" w:cs="" w:asciiTheme="minorHAnsi" w:cstheme="minorBidi" w:eastAsiaTheme="minorHAnsi" w:hAnsiTheme="minorHAnsi"/>
+      <w:color w:val="auto"/>
+      <w:kern w:val="2"/>
+      <w:sz w:val="22"/>
+      <w:szCs w:val="22"/>
+      <w:lang w:val="es-CO" w:eastAsia="en-US" w:bidi="ar-SA"/>
+      <w14:ligatures w14:val="standardContextual"/>
+    </w:rPr>
   </w:style>
-  <w:style w:type="paragraph" w:styleId="Ttulo1">
+  <w:style w:type="paragraph" w:styleId="Heading1">
     <w:name w:val="heading 1"/>
     <w:basedOn w:val="Normal"/>
     <w:link w:val="Ttulo1Car"/>
     <w:uiPriority w:val="9"/>
     <w:qFormat/>
-    <w:rsid w:val="00F251AC"/>
+    <w:rsid w:val="00f251ac"/>
     <w:pPr>
-      <w:spacing w:before="100" w:beforeAutospacing="1" w:after="100" w:afterAutospacing="1" w:line="240" w:lineRule="auto"/>
+      <w:spacing w:lineRule="auto" w:line="240" w:beforeAutospacing="1" w:afterAutospacing="1"/>
       <w:outlineLvl w:val="0"/>
     </w:pPr>
     <w:rPr>
-      <w:rFonts w:ascii="Times New Roman" w:eastAsia="Times New Roman" w:hAnsi="Times New Roman" w:cs="Times New Roman"/>
+      <w:rFonts w:ascii="Times New Roman" w:hAnsi="Times New Roman" w:eastAsia="Times New Roman" w:cs="Times New Roman"/>
       <w:b/>
       <w:bCs/>
-      <w:kern w:val="36"/>
+      <w:kern w:val="2"/>
       <w:sz w:val="48"/>
       <w:szCs w:val="48"/>
       <w:lang w:eastAsia="es-CO"/>
       <w14:ligatures w14:val="none"/>
     </w:rPr>
   </w:style>
-  <w:style w:type="paragraph" w:styleId="Ttulo2">
+  <w:style w:type="paragraph" w:styleId="Heading2">
     <w:name w:val="heading 2"/>
     <w:basedOn w:val="Normal"/>
     <w:link w:val="Ttulo2Car"/>
     <w:uiPriority w:val="9"/>
     <w:qFormat/>
-    <w:rsid w:val="00F251AC"/>
+    <w:rsid w:val="00f251ac"/>
     <w:pPr>
-      <w:spacing w:before="100" w:beforeAutospacing="1" w:after="100" w:afterAutospacing="1" w:line="240" w:lineRule="auto"/>
+      <w:spacing w:lineRule="auto" w:line="240" w:beforeAutospacing="1" w:afterAutospacing="1"/>
       <w:outlineLvl w:val="1"/>
     </w:pPr>
     <w:rPr>
-      <w:rFonts w:ascii="Times New Roman" w:eastAsia="Times New Roman" w:hAnsi="Times New Roman" w:cs="Times New Roman"/>
+      <w:rFonts w:ascii="Times New Roman" w:hAnsi="Times New Roman" w:eastAsia="Times New Roman" w:cs="Times New Roman"/>
       <w:b/>
       <w:bCs/>
       <w:kern w:val="0"/>
@@ -2174,52 +2808,16 @@
       <w14:ligatures w14:val="none"/>
     </w:rPr>
   </w:style>
-  <w:style w:type="character" w:default="1" w:styleId="Fuentedeprrafopredeter">
+  <w:style w:type="character" w:styleId="DefaultParagraphFont" w:default="1">
     <w:name w:val="Default Paragraph Font"/>
     <w:uiPriority w:val="1"/>
     <w:semiHidden/>
     <w:unhideWhenUsed/>
+    <w:rPr/>
   </w:style>
-  <w:style w:type="table" w:default="1" w:styleId="Tablanormal">
-    <w:name w:val="Normal Table"/>
-    <w:uiPriority w:val="99"/>
-    <w:semiHidden/>
-    <w:unhideWhenUsed/>
-    <w:tblPr>
-      <w:tblInd w:w="0" w:type="dxa"/>
-      <w:tblCellMar>
-        <w:top w:w="0" w:type="dxa"/>
-        <w:left w:w="108" w:type="dxa"/>
-        <w:bottom w:w="0" w:type="dxa"/>
-        <w:right w:w="108" w:type="dxa"/>
-      </w:tblCellMar>
-    </w:tblPr>
-  </w:style>
-  <w:style w:type="numbering" w:default="1" w:styleId="Sinlista">
-    <w:name w:val="No List"/>
-    <w:uiPriority w:val="99"/>
-    <w:semiHidden/>
-    <w:unhideWhenUsed/>
-  </w:style>
-  <w:style w:type="paragraph" w:customStyle="1" w:styleId="pdq2pgselectionanchorcontainer">
-    <w:name w:val="pdq2pg_selectionanchorcontainer"/>
-    <w:basedOn w:val="Normal"/>
-    <w:rsid w:val="00180407"/>
-    <w:pPr>
-      <w:spacing w:before="100" w:beforeAutospacing="1" w:after="100" w:afterAutospacing="1" w:line="240" w:lineRule="auto"/>
-    </w:pPr>
-    <w:rPr>
-      <w:rFonts w:ascii="Times New Roman" w:eastAsia="Times New Roman" w:hAnsi="Times New Roman" w:cs="Times New Roman"/>
-      <w:kern w:val="0"/>
-      <w:sz w:val="24"/>
-      <w:szCs w:val="24"/>
-      <w:lang w:eastAsia="es-CO"/>
-      <w14:ligatures w14:val="none"/>
-    </w:rPr>
-  </w:style>
-  <w:style w:type="character" w:styleId="Textoennegrita">
+  <w:style w:type="character" w:styleId="Strong">
     <w:name w:val="Strong"/>
-    <w:basedOn w:val="Fuentedeprrafopredeter"/>
+    <w:basedOn w:val="DefaultParagraphFont"/>
     <w:uiPriority w:val="22"/>
     <w:qFormat/>
     <w:rsid w:val="00180407"/>
@@ -2228,36 +2826,107 @@
       <w:bCs/>
     </w:rPr>
   </w:style>
-  <w:style w:type="character" w:customStyle="1" w:styleId="Ttulo1Car">
+  <w:style w:type="character" w:styleId="Ttulo1Car" w:customStyle="1">
     <w:name w:val="Título 1 Car"/>
-    <w:basedOn w:val="Fuentedeprrafopredeter"/>
-    <w:link w:val="Ttulo1"/>
+    <w:basedOn w:val="DefaultParagraphFont"/>
+    <w:link w:val="Heading1"/>
     <w:uiPriority w:val="9"/>
-    <w:rsid w:val="00F251AC"/>
+    <w:rsid w:val="00f251ac"/>
     <w:rPr>
-      <w:rFonts w:ascii="Times New Roman" w:eastAsia="Times New Roman" w:hAnsi="Times New Roman" w:cs="Times New Roman"/>
+      <w:rFonts w:ascii="Times New Roman" w:hAnsi="Times New Roman" w:eastAsia="Times New Roman" w:cs="Times New Roman"/>
       <w:b/>
       <w:bCs/>
-      <w:kern w:val="36"/>
+      <w:kern w:val="2"/>
       <w:sz w:val="48"/>
       <w:szCs w:val="48"/>
       <w:lang w:eastAsia="es-CO"/>
       <w14:ligatures w14:val="none"/>
     </w:rPr>
   </w:style>
-  <w:style w:type="character" w:customStyle="1" w:styleId="Ttulo2Car">
+  <w:style w:type="character" w:styleId="Ttulo2Car" w:customStyle="1">
     <w:name w:val="Título 2 Car"/>
-    <w:basedOn w:val="Fuentedeprrafopredeter"/>
-    <w:link w:val="Ttulo2"/>
+    <w:basedOn w:val="DefaultParagraphFont"/>
+    <w:link w:val="Heading2"/>
     <w:uiPriority w:val="9"/>
-    <w:rsid w:val="00F251AC"/>
+    <w:rsid w:val="00f251ac"/>
     <w:rPr>
-      <w:rFonts w:ascii="Times New Roman" w:eastAsia="Times New Roman" w:hAnsi="Times New Roman" w:cs="Times New Roman"/>
+      <w:rFonts w:ascii="Times New Roman" w:hAnsi="Times New Roman" w:eastAsia="Times New Roman" w:cs="Times New Roman"/>
       <w:b/>
       <w:bCs/>
       <w:kern w:val="0"/>
       <w:sz w:val="36"/>
       <w:szCs w:val="36"/>
+      <w:lang w:eastAsia="es-CO"/>
+      <w14:ligatures w14:val="none"/>
+    </w:rPr>
+  </w:style>
+  <w:style w:type="paragraph" w:styleId="Heading">
+    <w:name w:val="Heading"/>
+    <w:basedOn w:val="Normal"/>
+    <w:next w:val="BodyText"/>
+    <w:pPr>
+      <w:keepNext w:val="true"/>
+      <w:spacing w:before="240" w:after="120"/>
+    </w:pPr>
+    <w:rPr>
+      <w:rFonts w:ascii="Noto Sans" w:hAnsi="Noto Sans" w:eastAsia="Noto Sans CJK SC" w:cs="FreeSans"/>
+      <w:sz w:val="28"/>
+      <w:szCs w:val="28"/>
+    </w:rPr>
+  </w:style>
+  <w:style w:type="paragraph" w:styleId="BodyText">
+    <w:name w:val="Body Text"/>
+    <w:basedOn w:val="Normal"/>
+    <w:pPr>
+      <w:spacing w:lineRule="auto" w:line="276" w:before="0" w:after="140"/>
+    </w:pPr>
+    <w:rPr/>
+  </w:style>
+  <w:style w:type="paragraph" w:styleId="List">
+    <w:name w:val="List"/>
+    <w:basedOn w:val="BodyText"/>
+    <w:pPr/>
+    <w:rPr>
+      <w:rFonts w:cs="FreeSans"/>
+    </w:rPr>
+  </w:style>
+  <w:style w:type="paragraph" w:styleId="Caption">
+    <w:name w:val="caption"/>
+    <w:basedOn w:val="Normal"/>
+    <w:pPr>
+      <w:suppressLineNumbers/>
+      <w:spacing w:before="120" w:after="120"/>
+    </w:pPr>
+    <w:rPr>
+      <w:rFonts w:cs="FreeSans"/>
+      <w:i/>
+      <w:iCs/>
+      <w:sz w:val="24"/>
+      <w:szCs w:val="24"/>
+    </w:rPr>
+  </w:style>
+  <w:style w:type="paragraph" w:styleId="Index">
+    <w:name w:val="Index"/>
+    <w:basedOn w:val="Normal"/>
+    <w:pPr>
+      <w:suppressLineNumbers/>
+    </w:pPr>
+    <w:rPr>
+      <w:rFonts w:cs="FreeSans"/>
+    </w:rPr>
+  </w:style>
+  <w:style w:type="paragraph" w:styleId="pdq2pgselectionanchorcontainer" w:customStyle="1">
+    <w:name w:val="pdq2pg_selectionanchorcontainer"/>
+    <w:basedOn w:val="Normal"/>
+    <w:rsid w:val="00180407"/>
+    <w:pPr>
+      <w:spacing w:lineRule="auto" w:line="240" w:beforeAutospacing="1" w:afterAutospacing="1"/>
+    </w:pPr>
+    <w:rPr>
+      <w:rFonts w:ascii="Times New Roman" w:hAnsi="Times New Roman" w:eastAsia="Times New Roman" w:cs="Times New Roman"/>
+      <w:kern w:val="0"/>
+      <w:sz w:val="24"/>
+      <w:szCs w:val="24"/>
       <w:lang w:eastAsia="es-CO"/>
       <w14:ligatures w14:val="none"/>
     </w:rPr>
@@ -2268,12 +2937,12 @@
     <w:uiPriority w:val="99"/>
     <w:semiHidden/>
     <w:unhideWhenUsed/>
-    <w:rsid w:val="00F251AC"/>
+    <w:rsid w:val="00f251ac"/>
     <w:pPr>
-      <w:spacing w:before="100" w:beforeAutospacing="1" w:after="100" w:afterAutospacing="1" w:line="240" w:lineRule="auto"/>
+      <w:spacing w:lineRule="auto" w:line="240" w:beforeAutospacing="1" w:afterAutospacing="1"/>
     </w:pPr>
     <w:rPr>
-      <w:rFonts w:ascii="Times New Roman" w:eastAsia="Times New Roman" w:hAnsi="Times New Roman" w:cs="Times New Roman"/>
+      <w:rFonts w:ascii="Times New Roman" w:hAnsi="Times New Roman" w:eastAsia="Times New Roman" w:cs="Times New Roman"/>
       <w:kern w:val="0"/>
       <w:sz w:val="24"/>
       <w:szCs w:val="24"/>
@@ -2281,18 +2950,38 @@
       <w14:ligatures w14:val="none"/>
     </w:rPr>
   </w:style>
+  <w:style w:type="numbering" w:styleId="NoList" w:default="1">
+    <w:name w:val="No List"/>
+    <w:uiPriority w:val="99"/>
+    <w:semiHidden/>
+    <w:unhideWhenUsed/>
+  </w:style>
+  <w:style w:type="table" w:default="1" w:styleId="Tablanormal">
+    <w:name w:val="Normal Table"/>
+    <w:uiPriority w:val="99"/>
+    <w:semiHidden/>
+    <w:unhideWhenUsed/>
+    <w:tblPr>
+      <w:tblCellMar>
+        <w:top w:w="0" w:type="dxa"/>
+        <w:left w:w="108" w:type="dxa"/>
+        <w:bottom w:w="0" w:type="dxa"/>
+        <w:right w:w="108" w:type="dxa"/>
+      </w:tblCellMar>
+    </w:tblPr>
+  </w:style>
 </w:styles>
 </file>
 
 <file path=word/theme/theme1.xml><?xml version="1.0" encoding="utf-8"?>
-<a:theme xmlns:a="http://schemas.openxmlformats.org/drawingml/2006/main" name="Tema de Office">
+<a:theme xmlns:a="http://schemas.openxmlformats.org/drawingml/2006/main" xmlns:r="http://schemas.openxmlformats.org/officeDocument/2006/relationships" name="Tema de Office">
   <a:themeElements>
     <a:clrScheme name="Office">
       <a:dk1>
-        <a:sysClr val="windowText" lastClr="000000"/>
+        <a:srgbClr val="000000"/>
       </a:dk1>
       <a:lt1>
-        <a:sysClr val="window" lastClr="FFFFFF"/>
+        <a:srgbClr val="FFFFFF"/>
       </a:lt1>
       <a:dk2>
         <a:srgbClr val="44546A"/>
@@ -2327,7 +3016,7 @@
     </a:clrScheme>
     <a:fontScheme name="Office">
       <a:majorFont>
-        <a:latin typeface="Calibri Light" panose="020F0302020204030204"/>
+        <a:latin typeface="Calibri Light" panose="020F0302020204030204" pitchFamily="0" charset="1"/>
         <a:ea typeface=""/>
         <a:cs typeface=""/>
         <a:font script="Jpan" typeface="游ゴシック Light"/>
@@ -2379,7 +3068,7 @@
         <a:font script="Tfng" typeface="Ebrima"/>
       </a:majorFont>
       <a:minorFont>
-        <a:latin typeface="Calibri" panose="020F0502020204030204"/>
+        <a:latin typeface="Calibri" panose="020F0502020204030204" pitchFamily="0" charset="1"/>
         <a:ea typeface=""/>
         <a:cs typeface=""/>
         <a:font script="Jpan" typeface="游明朝"/>
@@ -2431,49 +3120,45 @@
         <a:font script="Tfng" typeface="Ebrima"/>
       </a:minorFont>
     </a:fontScheme>
-    <a:fmtScheme name="Office">
+    <a:fmtScheme>
       <a:fillStyleLst>
         <a:solidFill>
           <a:schemeClr val="phClr"/>
         </a:solidFill>
-        <a:gradFill rotWithShape="1">
+        <a:gradFill>
           <a:gsLst>
             <a:gs pos="0">
               <a:schemeClr val="phClr">
                 <a:lumMod val="110000"/>
-                <a:satMod val="105000"/>
                 <a:tint val="67000"/>
               </a:schemeClr>
             </a:gs>
             <a:gs pos="50000">
               <a:schemeClr val="phClr">
                 <a:lumMod val="105000"/>
-                <a:satMod val="103000"/>
                 <a:tint val="73000"/>
               </a:schemeClr>
             </a:gs>
             <a:gs pos="100000">
               <a:schemeClr val="phClr">
                 <a:lumMod val="105000"/>
-                <a:satMod val="109000"/>
                 <a:tint val="81000"/>
               </a:schemeClr>
             </a:gs>
           </a:gsLst>
           <a:lin ang="5400000" scaled="0"/>
+          <a:tileRect l="0" t="0" r="0" b="0"/>
         </a:gradFill>
-        <a:gradFill rotWithShape="1">
+        <a:gradFill>
           <a:gsLst>
             <a:gs pos="0">
               <a:schemeClr val="phClr">
-                <a:satMod val="103000"/>
                 <a:lumMod val="102000"/>
                 <a:tint val="94000"/>
               </a:schemeClr>
             </a:gs>
             <a:gs pos="50000">
               <a:schemeClr val="phClr">
-                <a:satMod val="110000"/>
                 <a:lumMod val="100000"/>
                 <a:shade val="100000"/>
               </a:schemeClr>
@@ -2481,33 +3166,24 @@
             <a:gs pos="100000">
               <a:schemeClr val="phClr">
                 <a:lumMod val="99000"/>
-                <a:satMod val="120000"/>
                 <a:shade val="78000"/>
               </a:schemeClr>
             </a:gs>
           </a:gsLst>
           <a:lin ang="5400000" scaled="0"/>
+          <a:tileRect l="0" t="0" r="0" b="0"/>
         </a:gradFill>
       </a:fillStyleLst>
       <a:lnStyleLst>
         <a:ln w="6350" cap="flat" cmpd="sng" algn="ctr">
-          <a:solidFill>
-            <a:schemeClr val="phClr"/>
-          </a:solidFill>
           <a:prstDash val="solid"/>
           <a:miter lim="800000"/>
         </a:ln>
         <a:ln w="12700" cap="flat" cmpd="sng" algn="ctr">
-          <a:solidFill>
-            <a:schemeClr val="phClr"/>
-          </a:solidFill>
           <a:prstDash val="solid"/>
           <a:miter lim="800000"/>
         </a:ln>
         <a:ln w="19050" cap="flat" cmpd="sng" algn="ctr">
-          <a:solidFill>
-            <a:schemeClr val="phClr"/>
-          </a:solidFill>
           <a:prstDash val="solid"/>
           <a:miter lim="800000"/>
         </a:ln>
@@ -2520,13 +3196,7 @@
           <a:effectLst/>
         </a:effectStyle>
         <a:effectStyle>
-          <a:effectLst>
-            <a:outerShdw blurRad="57150" dist="19050" dir="5400000" algn="ctr" rotWithShape="0">
-              <a:srgbClr val="000000">
-                <a:alpha val="63000"/>
-              </a:srgbClr>
-            </a:outerShdw>
-          </a:effectLst>
+          <a:effectLst/>
         </a:effectStyle>
       </a:effectStyleLst>
       <a:bgFillStyleLst>
@@ -2536,15 +3206,13 @@
         <a:solidFill>
           <a:schemeClr val="phClr">
             <a:tint val="95000"/>
-            <a:satMod val="170000"/>
           </a:schemeClr>
         </a:solidFill>
-        <a:gradFill rotWithShape="1">
+        <a:gradFill>
           <a:gsLst>
             <a:gs pos="0">
               <a:schemeClr val="phClr">
                 <a:tint val="93000"/>
-                <a:satMod val="150000"/>
                 <a:shade val="98000"/>
                 <a:lumMod val="102000"/>
               </a:schemeClr>
@@ -2552,7 +3220,6 @@
             <a:gs pos="50000">
               <a:schemeClr val="phClr">
                 <a:tint val="98000"/>
-                <a:satMod val="130000"/>
                 <a:shade val="90000"/>
                 <a:lumMod val="103000"/>
               </a:schemeClr>
@@ -2560,21 +3227,14 @@
             <a:gs pos="100000">
               <a:schemeClr val="phClr">
                 <a:shade val="63000"/>
-                <a:satMod val="120000"/>
               </a:schemeClr>
             </a:gs>
           </a:gsLst>
           <a:lin ang="5400000" scaled="0"/>
+          <a:tileRect l="0" t="0" r="0" b="0"/>
         </a:gradFill>
       </a:bgFillStyleLst>
     </a:fmtScheme>
   </a:themeElements>
-  <a:objectDefaults/>
-  <a:extraClrSchemeLst/>
-  <a:extLst>
-    <a:ext uri="{05A4C25C-085E-4340-85A3-A5531E510DB2}">
-      <thm15:themeFamily xmlns:thm15="http://schemas.microsoft.com/office/thememl/2012/main" name="Office Theme" id="{62F939B6-93AF-4DB8-9C6B-D6C7DFDC589F}" vid="{4A3C46E8-61CC-4603-A589-7422A47A8E4A}"/>
-    </a:ext>
-  </a:extLst>
 </a:theme>
 </file>
</xml_diff>